<commit_message>
Update paper draft, reports, and assets with per-sample ploidy estimation and optimized Word layouts
</commit_message>
<xml_diff>
--- a/docs/manuscript/biojava_paper_draft_es.docx
+++ b/docs/manuscript/biojava_paper_draft_es.docx
@@ -2,13 +2,13 @@
 <file path=word/document.xml><?xml version="1.0" encoding="utf-8"?>
 <w:document xmlns:w="http://schemas.openxmlformats.org/wordprocessingml/2006/main" xmlns:m="http://schemas.openxmlformats.org/officeDocument/2006/math" xmlns:r="http://schemas.openxmlformats.org/officeDocument/2006/relationships" xmlns:o="urn:schemas-microsoft-com:office:office" xmlns:v="urn:schemas-microsoft-com:vml" xmlns:w10="urn:schemas-microsoft-com:office:word" xmlns:a="http://schemas.openxmlformats.org/drawingml/2006/main" xmlns:pic="http://schemas.openxmlformats.org/drawingml/2006/picture" xmlns:wp="http://schemas.openxmlformats.org/drawingml/2006/wordprocessingDrawing">
   <w:body>
-    <w:bookmarkStart w:id="36" w:name="Xec9966fc20844e9c85f075b32b6c136501ac477"/>
+    <w:bookmarkStart w:id="37" w:name="X444f2e9b0e7a630e59cd33209f1d9f2d1863444"/>
     <w:p>
       <w:pPr>
         <w:pStyle w:val="Heading1"/>
       </w:pPr>
       <w:r>
-        <w:t xml:space="preserve">BioCenicana: Un Conjunto de Herramientas de Alto Rendimiento Basado en Transmisión de Datos (Streaming) para el Análisis Genómico de Poliploides con Aplicaciones en</w:t>
+        <w:t xml:space="preserve">BioJava: Un Conjunto de Herramientas de Alto Rendimiento Basado en Transmisión de Datos (Streaming) para el Análisis Genómico de Poliploides con Aplicaciones en</w:t>
       </w:r>
       <w:r>
         <w:t xml:space="preserve"> </w:t>
@@ -182,7 +182,7 @@
         <w:pStyle w:val="FirstParagraph"/>
       </w:pPr>
       <w:r>
-        <w:t xml:space="preserve">BioCenicana está desarrollado en el lenguaje de programación Java 11 y se distribuye como un único archivo ejecutable (formato JAR). Esto significa que la herramienta es portátil y puede ejecutarse en cualquier sistema operativo (Windows, Mac o Linux) sin requerir instalaciones complejas o configuraciones adicionales.</w:t>
+        <w:t xml:space="preserve">BioJava está desarrollado en el lenguaje de programación Java 11 y se distribuye como un único archivo ejecutable (formato JAR). Esto significa que la herramienta es portátil y puede ejecutarse en cualquier sistema operativo (Windows, Mac o Linux) sin requerir instalaciones complejas o configuraciones adicionales.</w:t>
       </w:r>
     </w:p>
     <w:p>
@@ -219,7 +219,7 @@
         <w:t xml:space="preserve"> </w:t>
       </w:r>
       <w:r>
-        <w:t xml:space="preserve">(Portable Operating System Interface), lo cual es simplemente un conjunto de reglas universales que aseguran que los comandos de BioCenicana se comporten de manera predecible y familiar para cualquier usuario (por ejemplo, usando guiones cortos para opciones simples como</w:t>
+        <w:t xml:space="preserve">(Portable Operating System Interface), lo cual es simplemente un conjunto de reglas universales que aseguran que los comandos de BioJava se comporten de manera predecible y familiar para cualquier usuario (por ejemplo, usando guiones cortos para opciones simples como</w:t>
       </w:r>
       <w:r>
         <w:t xml:space="preserve"> </w:t>
@@ -254,7 +254,7 @@
         <w:pStyle w:val="BodyText"/>
       </w:pPr>
       <w:r>
-        <w:t xml:space="preserve">El principio de diseño central, y la mayor ventaja técnica de BioCenicana, es su</w:t>
+        <w:t xml:space="preserve">El principio de diseño central, y la mayor ventaja técnica de BioJava, es su</w:t>
       </w:r>
       <w:r>
         <w:t xml:space="preserve"> </w:t>
@@ -267,7 +267,7 @@
         <w:t xml:space="preserve">motor de procesamiento secuencial (streaming)</w:t>
       </w:r>
       <w:r>
-        <w:t xml:space="preserve">. Normalmente, los programas de genómica intentan cargar todo el archivo de datos (VCF) en la memoria principal del computador (RAM) antes de analizarlo, lo cual hace que los equipos colapsen o se queden sin memoria cuando los archivos son muy grandes. Para solucionar esto, BioCenicana lee los archivos como si fuera un libro: avanza línea por línea extrayendo únicamente la información necesaria de forma temporal y descartando el resto.</w:t>
+        <w:t xml:space="preserve">. Normalmente, los programas de genómica intentan cargar todo el archivo de datos (VCF) en la memoria principal del computador (RAM) antes de analizarlo, lo cual hace que los equipos colapsen o se queden sin memoria cuando los archivos son muy grandes. Para solucionar esto, BioJava lee los archivos como si fuera un libro: avanza línea por línea extrayendo únicamente la información necesaria de forma temporal y descartando el resto.</w:t>
       </w:r>
     </w:p>
     <w:p>
@@ -326,7 +326,7 @@
         <w:pStyle w:val="FirstParagraph"/>
       </w:pPr>
       <w:r>
-        <w:t xml:space="preserve">BioCenicana está estructurado en cinco módulos principales, cada uno diseñado para ejecutar una etapa específica del análisis genómico y producir resultados visuales directamente interpretables:</w:t>
+        <w:t xml:space="preserve">BioJava está estructurado en seis módulos principales, cada uno diseñado para ejecutar una etapa específica del análisis genómico y producir resultados visuales directamente interpretables:</w:t>
       </w:r>
     </w:p>
     <w:p>
@@ -572,8 +572,45 @@
         <w:t xml:space="preserve">Herramientas para comparar grandes bloques de cromosomas entre dos especies o variedades (sintenia) e identificar matemáticamente qué genes están bajo presión de selección evolutiva.</w:t>
       </w:r>
     </w:p>
+    <w:p>
+      <w:pPr>
+        <w:pStyle w:val="Compact"/>
+        <w:numPr>
+          <w:ilvl w:val="0"/>
+          <w:numId w:val="1001"/>
+        </w:numPr>
+      </w:pPr>
+      <w:r>
+        <w:rPr>
+          <w:rStyle w:val="VerbatimChar"/>
+          <w:b/>
+          <w:bCs/>
+        </w:rPr>
+        <w:t xml:space="preserve">gwas</w:t>
+      </w:r>
+      <w:r>
+        <w:rPr>
+          <w:b/>
+          <w:bCs/>
+        </w:rPr>
+        <w:t xml:space="preserve"> </w:t>
+      </w:r>
+      <w:r>
+        <w:rPr>
+          <w:b/>
+          <w:bCs/>
+        </w:rPr>
+        <w:t xml:space="preserve">(Mapeo de Asociación):</w:t>
+      </w:r>
+      <w:r>
+        <w:t xml:space="preserve"> </w:t>
+      </w:r>
+      <w:r>
+        <w:t xml:space="preserve">Motor de mapeo de asociación de genoma completo optimizado para poliploides, que integra corrección por parentesco (Kinship) y estructura poblacional (LOCO).</w:t>
+      </w:r>
+    </w:p>
     <w:bookmarkEnd w:id="11"/>
-    <w:bookmarkStart w:id="17" w:name="X320780f76e63736cf70cb459095b3b68b8b8286"/>
+    <w:bookmarkStart w:id="18" w:name="X320780f76e63736cf70cb459095b3b68b8b8286"/>
     <w:p>
       <w:pPr>
         <w:pStyle w:val="Heading3"/>
@@ -587,7 +624,7 @@
         <w:pStyle w:val="FirstParagraph"/>
       </w:pPr>
       <w:r>
-        <w:t xml:space="preserve">A continuación, se detalla la metodología de construcción de cada módulo, integrando explícitamente los principios biológicos, los modelos estadísticos/matemáticos subyacentes y las estrategias bioinformáticas implementadas en el código de BioCenicana.</w:t>
+        <w:t xml:space="preserve">A continuación, se detalla la metodología de construcción de cada módulo, integrando explícitamente los principios biológicos, los modelos estadísticos/matemáticos subyacentes y las estrategias bioinformáticas implementadas en el código de BioJava.</w:t>
       </w:r>
     </w:p>
     <w:bookmarkStart w:id="12" w:name="Xb67565f94037e3710073ce99869adaec5795e3a"/>
@@ -719,7 +756,7 @@
         <w:t xml:space="preserve"> </w:t>
       </w:r>
       <w:r>
-        <w:t xml:space="preserve">de BioCenicana. A diferencia de los programas de genómica tradicionales que intentan cargar todo el archivo masivo directamente en la memoria principal (RAM) —lo que suele causar colapsos en computadores de escritorio— un</w:t>
+        <w:t xml:space="preserve">de BioJava. A diferencia de los programas de genómica tradicionales que intentan cargar todo el archivo masivo directamente en la memoria principal (RAM) —lo que suele causar colapsos en computadores de escritorio— un</w:t>
       </w:r>
       <w:r>
         <w:t xml:space="preserve"> </w:t>
@@ -1123,7 +1160,7 @@
         <w:pStyle w:val="FirstParagraph"/>
       </w:pPr>
       <w:r>
-        <w:t xml:space="preserve">Este sofisticado enfoque probabilístico permite a BioCenicana asignar valores genotípicos con decimales (por ejemplo, estimar que la dosis es de 3.4 copias en lugar de redondear bruscamente a 3). Esto minimiza dramáticamente el sesgo técnico generado por la secuenciación incompleta y retiene la valiosa incertidumbre estadística para los análisis posteriores.</w:t>
+        <w:t xml:space="preserve">Este sofisticado enfoque probabilístico permite a BioJava asignar valores genotípicos con decimales (por ejemplo, estimar que la dosis es de 3.4 copias en lugar de redondear bruscamente a 3). Esto minimiza dramáticamente el sesgo técnico generado por la secuenciación incompleta y retiene la valiosa incertidumbre estadística para los análisis posteriores.</w:t>
       </w:r>
     </w:p>
     <w:p>
@@ -1407,7 +1444,7 @@
         <w:rPr>
           <w:rStyle w:val="NormalTok"/>
         </w:rPr>
-        <w:t xml:space="preserve"> biocenicana.jar vcf-stats </w:t>
+        <w:t xml:space="preserve"> biojava.jar vcf-stats </w:t>
       </w:r>
       <w:r>
         <w:rPr>
@@ -1482,7 +1519,7 @@
         <w:rPr>
           <w:rStyle w:val="NormalTok"/>
         </w:rPr>
-        <w:t xml:space="preserve"> biocenicana.jar vcf-filter </w:t>
+        <w:t xml:space="preserve"> biojava.jar vcf-filter </w:t>
       </w:r>
       <w:r>
         <w:rPr>
@@ -1633,7 +1670,7 @@
         <w:t xml:space="preserve">admixture</w:t>
       </w:r>
       <w:r>
-        <w:t xml:space="preserve">) es biológicamente esencial para evitar resultados falsos positivos en estudios de asociación (GWAS) y para orientar cruces estratégicos en programas de mejoramiento. Las poblaciones modernas de caña de azúcar, caracterizadas por su extrema complejidad, son el resultado de introgresiones históricas continuas entre especies domesticadas y silvestres. Para mapear y desenredar esta intrincada red genética, BioCenicana ejecuta un flujo de trabajo estadístico secuencial: primero, reduce la enorme dimensionalidad de los datos genómicos para hacerlos interpretables; segundo, calcula una matriz exacta del parentesco entre las accesiones; y finalmente, despliega modelos algorítmicos de agrupamiento (</w:t>
+        <w:t xml:space="preserve">) es biológicamente esencial para evitar resultados falsos positivos en estudios de asociación (GWAS) y para orientar cruces estratégicos en programas de mejoramiento. Las poblaciones modernas de caña de azúcar, caracterizadas por su extrema complejidad, son el resultado de introgresiones históricas continuas entre especies domesticadas y silvestres. Para mapear y desenredar esta intrincada red genética, BioJava ejecuta un flujo de trabajo estadístico secuencial: primero, reduce la enorme dimensionalidad de los datos genómicos para hacerlos interpretables; segundo, calcula una matriz exacta del parentesco entre las accesiones; y finalmente, despliega modelos algorítmicos de agrupamiento (</w:t>
       </w:r>
       <w:r>
         <w:rPr>
@@ -1681,7 +1718,7 @@
         <w:t xml:space="preserve">Kinship</w:t>
       </w:r>
       <w:r>
-        <w:t xml:space="preserve">), la cual es esencialmente una tabla cuadrada que cuantifica el grado de similitud biológica entre todos los pares posibles de individuos. BioCenicana utiliza el método de VanRaden (2008) adaptado para poliploides. La lógica estadística de este método asume que si dos plantas comparten un alelo muy raro (con baja frecuencia poblacional), están mucho más estrechamente emparentadas que si comparten un alelo muy común. Para lograrlo, la fórmula resta a la dosis alélica de cada planta (</w:t>
+        <w:t xml:space="preserve">), la cual es esencialmente una tabla cuadrada que cuantifica el grado de similitud biológica entre todos los pares posibles de individuos. BioJava utiliza el método de VanRaden (2008) adaptado para poliploides. La lógica estadística de este método asume que si dos plantas comparten un alelo muy raro (con baja frecuencia poblacional), están mucho más estrechamente emparentadas que si comparten un alelo muy común. Para lograrlo, la fórmula resta a la dosis alélica de cada planta (</w:t>
       </w:r>
       <m:oMath>
         <m:r>
@@ -2000,7 +2037,7 @@
         <w:rPr>
           <w:rStyle w:val="NormalTok"/>
         </w:rPr>
-        <w:t xml:space="preserve"> biocenicana.jar pop-structure </w:t>
+        <w:t xml:space="preserve"> biojava.jar pop-structure </w:t>
       </w:r>
       <w:r>
         <w:rPr>
@@ -2292,7 +2329,7 @@
         </m:sSup>
       </m:oMath>
       <w:r>
-        <w:t xml:space="preserve">. Los valores numéricos generados por este estadístico fluctúan estrictamente entre 0 (lo que indica que los marcadores se heredan de manera completamente aleatoria e independiente) y 1 (lo que indica que los marcadores se heredan siempre juntos como un bloque perfecto e inquebrantable). El núcleo algorítmico de BioCenicana para calcular esta matriz de</w:t>
+        <w:t xml:space="preserve">. Los valores numéricos generados por este estadístico fluctúan estrictamente entre 0 (lo que indica que los marcadores se heredan de manera completamente aleatoria e independiente) y 1 (lo que indica que los marcadores se heredan siempre juntos como un bloque perfecto e inquebrantable). El núcleo algorítmico de BioJava para calcular esta matriz de</w:t>
       </w:r>
       <w:r>
         <w:t xml:space="preserve"> </w:t>
@@ -2315,7 +2352,7 @@
         <w:t xml:space="preserve"> </w:t>
       </w:r>
       <w:r>
-        <w:t xml:space="preserve">toma como base el histórico modelo formulado por Hill y Robertson (Hill &amp; Robertson, 1968), el cual estimaba originalmente las varianzas y covarianzas de frecuencias alélicas en poblaciones finitas. Sin embargo, BioCenicana implementa una optimización estadística profunda de este modelo. Las herramientas tradicionales se limitan a fenotipos diploides discretos (donde un marcador simplemente se categoriza como presente o ausente, ej. 0, 1 o 2). En contraste, el algoritmo de BioCenicana fue generalizado algebraicamente para procesar variables de</w:t>
+        <w:t xml:space="preserve">toma como base el histórico modelo formulado por Hill y Robertson (Hill &amp; Robertson, 1968), el cual estimaba originalmente las varianzas y covarianzas de frecuencias alélicas en poblaciones finitas. Sin embargo, BioJava implementa una optimización estadística profunda de este modelo. Las herramientas tradicionales se limitan a fenotipos diploides discretos (donde un marcador simplemente se categoriza como presente o ausente, ej. 0, 1 o 2). En contraste, el algoritmo de BioJava fue generalizado algebraicamente para procesar variables de</w:t>
       </w:r>
       <w:r>
         <w:t xml:space="preserve"> </w:t>
@@ -2387,7 +2424,7 @@
         <w:t xml:space="preserve"> </w:t>
       </w:r>
       <w:r>
-        <w:t xml:space="preserve">entre todas las combinaciones posibles de 50,000 marcadores genéticos implicaría billones de operaciones matemáticas — un problema computacionalmente explosivo que saturaría la memoria de cualquier estación de trabajo convencional. Para sortear esto, el módulo fue diseñado empleando un algoritmo bioinformático de ventana deslizante (</w:t>
+        <w:t xml:space="preserve">entre todas las combinaciones posibles de 50,000 marcadores genéticos implicaría billones de operaciones matemáticas — un problema computacionalmente explosivo que soportaría la memoria de cualquier estación de trabajo convencional. Para sortear esto, el módulo fue diseñado empleando un algoritmo bioinformático de ventana deslizante (</w:t>
       </w:r>
       <w:r>
         <w:rPr>
@@ -2518,7 +2555,7 @@
         <w:rPr>
           <w:rStyle w:val="NormalTok"/>
         </w:rPr>
-        <w:t xml:space="preserve"> biocenicana.jar ld </w:t>
+        <w:t xml:space="preserve"> biojava.jar ld </w:t>
       </w:r>
       <w:r>
         <w:rPr>
@@ -2632,7 +2669,7 @@
         <w:pStyle w:val="FirstParagraph"/>
       </w:pPr>
       <w:r>
-        <w:t xml:space="preserve">Determinar la historia evolutiva de las plantas es un pilar fundamental en la conservación y el aprovechamiento de los recursos fitogenéticos. Biológicamente, conocer la filogenia permite a los taxónomos y genetistas validar pedigrís históricos, separar especies puras de híbridos de introgresión, e identificar visualmente el grado de parentesco biológico. Para lograr esto a partir de datos genómicos masivos, BioCenicana inicia su flujo de trabajo calculando una inmensa matriz de distancias genéticas emparejadas. Matemáticamente, el módulo emplea una métrica de</w:t>
+        <w:t xml:space="preserve">Determinar la historia evolutiva de las plantas es un pilar fundamental en la conservación y el aprovechamiento de los recursos fitogenéticos. Biológicamente, conocer la filogenia permite a los taxónomos y genetistas validar pedigrís históricos, separar especies puras de híbridos de introgresión, e identificar visualmente el grado de parentesco biológico. Para lograr esto a partir de datos genómicos masivos, BioJava inicia su flujo de trabajo calculando una inmensa matriz de distancias genéticas emparejadas. Matemáticamente, el módulo emplea una métrica de</w:t>
       </w:r>
       <w:r>
         <w:t xml:space="preserve"> </w:t>
@@ -2665,7 +2702,7 @@
         <w:pStyle w:val="BodyText"/>
       </w:pPr>
       <w:r>
-        <w:t xml:space="preserve">Una vez que se tiene una tabla con la distancia exacta de cada planta respecto a todas las demás, se debe inferir y dibujar la topología evolutiva. Para ello, BioCenicana implementa el algoritmo</w:t>
+        <w:t xml:space="preserve">Una vez que se tiene una tabla con la distancia exacta de cada planta respecto a todas las demás, se debe inferir y dibujar la topología evolutiva. Para ello, BioJava implementa el algoritmo</w:t>
       </w:r>
       <w:r>
         <w:t xml:space="preserve"> </w:t>
@@ -2897,7 +2934,7 @@
         <w:rPr>
           <w:rStyle w:val="NormalTok"/>
         </w:rPr>
-        <w:t xml:space="preserve"> biocenicana.jar snp-tree </w:t>
+        <w:t xml:space="preserve"> biojava.jar snp-tree </w:t>
       </w:r>
       <w:r>
         <w:rPr>
@@ -3103,7 +3140,7 @@
         <w:t xml:space="preserve">SyMAP</w:t>
       </w:r>
       <w:r>
-        <w:t xml:space="preserve">. BioCenicana toma los resultados tabulares generados por estos programas, los cruza con las coordenadas físicas de los genomas (archivos GFF) y los convierte directamente en representaciones visuales interactivas.</w:t>
+        <w:t xml:space="preserve">. BioJava toma los resultados tabulares generados por estos programas, los cruza con las coordenadas físicas de los genomas (archivos GFF) y los convierte directamente en representaciones visuales interactivas.</w:t>
       </w:r>
     </w:p>
     <w:p>
@@ -3181,7 +3218,7 @@
         <w:t xml:space="preserve"> </w:t>
       </w:r>
       <w:r>
-        <w:t xml:space="preserve">(regiones muy conservadas). Como resultado, BioCenicana genera múltiples salidas gráficas, como diagramas circulares (tipo</w:t>
+        <w:t xml:space="preserve">(regiones muy conservadas). Como resultado, BioJava genera múltiples salidas gráficas, como diagramas circulares (tipo</w:t>
       </w:r>
       <w:r>
         <w:t xml:space="preserve"> </w:t>
@@ -3384,7 +3421,7 @@
         <w:t xml:space="preserve">Ka/Ks</w:t>
       </w:r>
       <w:r>
-        <w:t xml:space="preserve">: la proporción entre las tasas de sustitución que alteran el aminoácido (Ka) frente a las mutaciones sinónimas que no lo alteran (Ks), empleando el modelo de Nei-Gojobori (Nei &amp; Gojobori, 1986). A nivel de ejecución, BioCenicana lee los genes en formato FASTA, realiza los alineamientos de codones paralelizando el cálculo con múltiples procesadores (</w:t>
+        <w:t xml:space="preserve">: la proporción entre las tasas de sustitución que alteran el aminoácido (Ka) frente a las mutaciones sinónimas que no lo alteran (Ks), empleando el modelo de Nei-Gojobori (Nei &amp; Gojobori, 1986). A nivel de ejecución, BioJava lee los genes en formato FASTA, realiza los alineamientos de codones paralelizando el cálculo con múltiples procesadores (</w:t>
       </w:r>
       <w:r>
         <w:rPr>
@@ -3452,7 +3489,7 @@
         <w:rPr>
           <w:rStyle w:val="NormalTok"/>
         </w:rPr>
-        <w:t xml:space="preserve"> target/biocenicana-1.0.jar comp-gen </w:t>
+        <w:t xml:space="preserve"> biojava.jar comp-gen </w:t>
       </w:r>
       <w:r>
         <w:rPr>
@@ -3797,7 +3834,7 @@
         <w:rPr>
           <w:rStyle w:val="NormalTok"/>
         </w:rPr>
-        <w:t xml:space="preserve"> biocenicana.jar kaks-calc </w:t>
+        <w:t xml:space="preserve"> biojava.jar kaks-calc </w:t>
       </w:r>
       <w:r>
         <w:rPr>
@@ -3837,117 +3874,162 @@
       </w:r>
     </w:p>
     <w:bookmarkEnd w:id="16"/>
-    <w:bookmarkEnd w:id="17"/>
-    <w:bookmarkStart w:id="18" w:name="X79371b742f114649b43b1633e28d0641637af8a"/>
-    <w:p>
-      <w:pPr>
-        <w:pStyle w:val="Heading3"/>
-      </w:pPr>
-      <w:r>
-        <w:t xml:space="preserve">Validación Funcional y Comparativa (</w:t>
+    <w:bookmarkStart w:id="17" w:name="X5ea689c302ddcf51226316fcf8b7b6abb30c81f"/>
+    <w:p>
+      <w:pPr>
+        <w:pStyle w:val="Heading4"/>
+      </w:pPr>
+      <w:r>
+        <w:t xml:space="preserve">6. Módulo de Asociación de Genoma Completo (</w:t>
+      </w:r>
+      <w:r>
+        <w:rPr>
+          <w:rStyle w:val="VerbatimChar"/>
+        </w:rPr>
+        <w:t xml:space="preserve">gwas</w:t>
+      </w:r>
+      <w:r>
+        <w:t xml:space="preserve">)</w:t>
+      </w:r>
+    </w:p>
+    <w:p>
+      <w:pPr>
+        <w:pStyle w:val="FirstParagraph"/>
+      </w:pPr>
+      <w:r>
+        <w:t xml:space="preserve">A diferencia de las herramientas convencionales, BioJava permite evaluar múltiples</w:t>
+      </w:r>
+      <w:r>
+        <w:t xml:space="preserve"> </w:t>
+      </w:r>
+      <w:r>
+        <w:rPr>
+          <w:b/>
+          <w:bCs/>
+        </w:rPr>
+        <w:t xml:space="preserve">modelos de acción génica</w:t>
+      </w:r>
+      <w:r>
+        <w:t xml:space="preserve"> </w:t>
+      </w:r>
+      <w:r>
+        <w:t xml:space="preserve">para capturar la complejidad de la herencia en poliploides. Siguiendo las recomendaciones de Rosyara et al. (2016), el toolkit implementa:</w:t>
+      </w:r>
+      <w:r>
+        <w:t xml:space="preserve"> </w:t>
+      </w:r>
+      <w:r>
+        <w:t xml:space="preserve">1.</w:t>
+      </w:r>
+      <w:r>
+        <w:t xml:space="preserve"> </w:t>
+      </w:r>
+      <w:r>
+        <w:rPr>
+          <w:b/>
+          <w:bCs/>
+        </w:rPr>
+        <w:t xml:space="preserve">Modelo Aditivo:</w:t>
+      </w:r>
+      <w:r>
+        <w:t xml:space="preserve"> </w:t>
+      </w:r>
+      <w:r>
+        <w:t xml:space="preserve">Basado en la dosis alélica continua.</w:t>
+      </w:r>
+      <w:r>
+        <w:t xml:space="preserve"> </w:t>
+      </w:r>
+      <w:r>
+        <w:t xml:space="preserve">2.</w:t>
+      </w:r>
+      <w:r>
+        <w:t xml:space="preserve"> </w:t>
+      </w:r>
+      <w:r>
+        <w:rPr>
+          <w:b/>
+          <w:bCs/>
+        </w:rPr>
+        <w:t xml:space="preserve">Modelos Dominantes (Simplex y Duplex):</w:t>
+      </w:r>
+      <w:r>
+        <w:t xml:space="preserve"> </w:t>
+      </w:r>
+      <w:r>
+        <w:t xml:space="preserve">Capturan efectos de dominancia al re-codificar la dosis como una variable binaria según un umbral de copias del alelo alternativo.</w:t>
+      </w:r>
+      <w:r>
+        <w:t xml:space="preserve"> </w:t>
+      </w:r>
+      <w:r>
+        <w:t xml:space="preserve">3.</w:t>
+      </w:r>
+      <w:r>
+        <w:t xml:space="preserve"> </w:t>
+      </w:r>
+      <w:r>
+        <w:rPr>
+          <w:b/>
+          <w:bCs/>
+        </w:rPr>
+        <w:t xml:space="preserve">Modelo General:</w:t>
+      </w:r>
+      <w:r>
+        <w:t xml:space="preserve"> </w:t>
+      </w:r>
+      <w:r>
+        <w:t xml:space="preserve">Trata cada nivel de dosis como un factor independiente mediante un test de F con múltiples grados de libertad (</w:t>
+      </w:r>
+      <m:oMath>
+        <m:r>
+          <m:t>d</m:t>
+        </m:r>
+        <m:r>
+          <m:t>f</m:t>
+        </m:r>
+        <m:r>
+          <m:rPr>
+            <m:sty m:val="p"/>
+          </m:rPr>
+          <m:t>=</m:t>
+        </m:r>
+        <m:r>
+          <m:t>k</m:t>
+        </m:r>
+        <m:r>
+          <m:rPr>
+            <m:sty m:val="p"/>
+          </m:rPr>
+          <m:t>−</m:t>
+        </m:r>
+        <m:r>
+          <m:t>1</m:t>
+        </m:r>
+      </m:oMath>
+      <w:r>
+        <w:t xml:space="preserve">), permitiendo detectar loci con efectos no lineales complejos.</w:t>
+      </w:r>
+    </w:p>
+    <w:p>
+      <w:pPr>
+        <w:pStyle w:val="BodyText"/>
+      </w:pPr>
+      <w:r>
+        <w:t xml:space="preserve">Esta flexibilidad, combinada con el motor de</w:t>
+      </w:r>
+      <w:r>
+        <w:t xml:space="preserve"> </w:t>
       </w:r>
       <w:r>
         <w:rPr>
           <w:i/>
           <w:iCs/>
         </w:rPr>
-        <w:t xml:space="preserve">Benchmarking</w:t>
-      </w:r>
-      <w:r>
-        <w:t xml:space="preserve">)</w:t>
-      </w:r>
-    </w:p>
-    <w:p>
-      <w:pPr>
-        <w:pStyle w:val="FirstParagraph"/>
-      </w:pPr>
-      <w:r>
-        <w:t xml:space="preserve">Para asegurar la fiabilidad de los algoritmos implementados y cuantificar rigurosamente la ganancia en eficiencia operativa, se diseñó un protocolo de validación comparativa (</w:t>
-      </w:r>
-      <w:r>
-        <w:rPr>
-          <w:i/>
-          <w:iCs/>
-        </w:rPr>
-        <w:t xml:space="preserve">benchmarking</w:t>
-      </w:r>
-      <w:r>
-        <w:t xml:space="preserve">) utilizando el panel genómico de 220 accesiones de</w:t>
-      </w:r>
-      <w:r>
-        <w:t xml:space="preserve"> </w:t>
-      </w:r>
-      <w:r>
-        <w:rPr>
-          <w:i/>
-          <w:iCs/>
-        </w:rPr>
-        <w:t xml:space="preserve">Saccharum</w:t>
-      </w:r>
-      <w:r>
-        <w:t xml:space="preserve"> </w:t>
-      </w:r>
-      <w:r>
-        <w:t xml:space="preserve">spp. (50,728 variantes iniciales). BioCenicana fue evaluado frente a dos herramientas consideradas estándares de la industria en genómica vegetal. Para los módulos de control de calidad, se seleccionó</w:t>
-      </w:r>
-      <w:r>
-        <w:t xml:space="preserve"> </w:t>
-      </w:r>
-      <w:r>
-        <w:rPr>
-          <w:b/>
-          <w:bCs/>
-        </w:rPr>
-        <w:t xml:space="preserve">NGSEP 5.1.0</w:t>
-      </w:r>
-      <w:r>
-        <w:t xml:space="preserve"> </w:t>
-      </w:r>
-      <w:r>
-        <w:t xml:space="preserve">(Duitama et al., 2014) —específicamente sus subcomandos</w:t>
-      </w:r>
-      <w:r>
-        <w:t xml:space="preserve"> </w:t>
-      </w:r>
-      <w:r>
-        <w:rPr>
-          <w:rStyle w:val="VerbatimChar"/>
-        </w:rPr>
-        <w:t xml:space="preserve">VCFSummaryStats</w:t>
-      </w:r>
-      <w:r>
-        <w:t xml:space="preserve"> </w:t>
-      </w:r>
-      <w:r>
-        <w:t xml:space="preserve">y</w:t>
-      </w:r>
-      <w:r>
-        <w:t xml:space="preserve"> </w:t>
-      </w:r>
-      <w:r>
-        <w:rPr>
-          <w:rStyle w:val="VerbatimChar"/>
-        </w:rPr>
-        <w:t xml:space="preserve">VCFFilter</w:t>
-      </w:r>
-      <w:r>
-        <w:t xml:space="preserve">— debido a su robustez comprobada en el análisis de genomas complejos y su amplio uso en programas de mejoramiento agronómico. Para la validación del análisis de ligamiento, se empleó</w:t>
-      </w:r>
-      <w:r>
-        <w:t xml:space="preserve"> </w:t>
-      </w:r>
-      <w:r>
-        <w:rPr>
-          <w:b/>
-          <w:bCs/>
-        </w:rPr>
-        <w:t xml:space="preserve">PopLDdecay</w:t>
-      </w:r>
-      <w:r>
-        <w:t xml:space="preserve"> </w:t>
-      </w:r>
-      <w:r>
-        <w:t xml:space="preserve">(Zhang et al., 2019), un software que, si bien es ampliamente citado para la generación de curvas de LD, fue diseñado con una arquitectura intrínsecamente orientada a especies diploides.</w:t>
+        <w:t xml:space="preserve">streaming</w:t>
+      </w:r>
+      <w:r>
+        <w:t xml:space="preserve">, posiciona a BioJava como una alternativa eficiente a GWASpoly para el análisis de grandes poblaciones genotipadas por secuenciación (GBS).</w:t>
       </w:r>
     </w:p>
     <w:p>
@@ -3955,26 +4037,22 @@
         <w:pStyle w:val="BodyText"/>
       </w:pPr>
       <w:r>
-        <w:t xml:space="preserve">Para garantizar una comparación técnica justa e imparcial, el diseño experimental estandarizó de forma estricta las condiciones de ejecución. Las pruebas se realizaron en una estación de trabajo equipada con sistema operativo macOS y OpenJDK 25, limitando explícitamente el procesamiento a 4 núcleos en paralelo (</w:t>
-      </w:r>
-      <w:r>
-        <w:rPr>
-          <w:rStyle w:val="VerbatimChar"/>
-        </w:rPr>
-        <w:t xml:space="preserve">-t 4</w:t>
-      </w:r>
-      <w:r>
-        <w:t xml:space="preserve">) en todas las herramientas. Adicionalmente, para evitar que la memoria caché temporal del sistema operativo acelerara artificialmente las pruebas subsiguientes (sesgo de I/O), las cachés de memoria se purgaron completamente entre cada ejecución individual. Cada proceso analítico fue ejecutado en tres réplicas independientes, reportándose el tiempo promedio real (</w:t>
-      </w:r>
-      <w:r>
-        <w:rPr>
-          <w:i/>
-          <w:iCs/>
-        </w:rPr>
-        <w:t xml:space="preserve">wall-clock time</w:t>
-      </w:r>
-      <w:r>
-        <w:t xml:space="preserve">) medido desde la pulsación del comando hasta la escritura definitiva del archivo de salida.</w:t>
+        <w:t xml:space="preserve">El objetivo final de BioJava es facilitar la identificación de las bases genéticas que controlan rasgos de importancia agronómica. Para ello, el módulo</w:t>
+      </w:r>
+      <w:r>
+        <w:t xml:space="preserve"> </w:t>
+      </w:r>
+      <w:r>
+        <w:rPr>
+          <w:rStyle w:val="VerbatimChar"/>
+        </w:rPr>
+        <w:t xml:space="preserve">gwas</w:t>
+      </w:r>
+      <w:r>
+        <w:t xml:space="preserve"> </w:t>
+      </w:r>
+      <w:r>
+        <w:t xml:space="preserve">implementa un modelo lineal mixto (MLM) basado en el algoritmo EMMAX (P3D). A diferencia de los modelos lineales simples, el MLM permite controlar los falsos positivos generados por el parentesco oculto y la estructura poblacional, un desafío crítico en la caña de azúcar debido a su base genética estrecha.</w:t>
       </w:r>
     </w:p>
     <w:p>
@@ -3982,60 +4060,48 @@
         <w:pStyle w:val="BodyText"/>
       </w:pPr>
       <w:r>
-        <w:t xml:space="preserve">La validación algorítmica se evaluó bajo dos dimensiones críticas. La primera fue la</w:t>
-      </w:r>
-      <w:r>
-        <w:t xml:space="preserve"> </w:t>
-      </w:r>
-      <w:r>
-        <w:rPr>
-          <w:b/>
-          <w:bCs/>
-        </w:rPr>
-        <w:t xml:space="preserve">Precisión Aritmética</w:t>
-      </w:r>
-      <w:r>
-        <w:t xml:space="preserve">. Se configuraron los mismos umbrales biológicos exactos en BioCenicana y NGSEP (frecuencia MAF ≥ 0.05 y datos faltantes ≤ 20%) para verificar rigurosamente que el conteo final de variantes retenidas, la frecuencia alélica poblacional y las tasas de transiciones/transversiones (Ts/Tv) resultaran estadísticamente idénticas. Esto aseguró que las mejoras en velocidad documentadas no fueran producto de atajos algorítmicos. La segunda dimensión fue el</w:t>
-      </w:r>
-      <w:r>
-        <w:t xml:space="preserve"> </w:t>
-      </w:r>
-      <w:r>
-        <w:rPr>
-          <w:b/>
-          <w:bCs/>
-        </w:rPr>
-        <w:t xml:space="preserve">Rendimiento Computacional</w:t>
-      </w:r>
-      <w:r>
-        <w:t xml:space="preserve">, diseñada para contrastar la agilidad del motor secuencial (</w:t>
-      </w:r>
-      <w:r>
-        <w:rPr>
-          <w:i/>
-          <w:iCs/>
-        </w:rPr>
-        <w:t xml:space="preserve">streaming engine</w:t>
-      </w:r>
-      <w:r>
-        <w:t xml:space="preserve">) de BioCenicana frente a la gestión de memoria RAM en bloque característica de las herramientas tradicionales.</w:t>
-      </w:r>
-    </w:p>
-    <w:p>
-      <w:pPr>
-        <w:pStyle w:val="BodyText"/>
-      </w:pPr>
-      <w:r>
-        <w:t xml:space="preserve">Finalmente, para la evaluación del Desequilibrio de Ligamiento (LD), se estructuró un análisis de</w:t>
-      </w:r>
-      <w:r>
-        <w:t xml:space="preserve"> </w:t>
-      </w:r>
-      <w:r>
-        <w:t xml:space="preserve">“perturbación de ploidía”</w:t>
-      </w:r>
-      <w:r>
-        <w:t xml:space="preserve">. Utilizando exactamente los mismos genotipos filtrados, se calcularon las matrices de covarianza haplotípica bajo tres restricciones matemáticas distintas: (1) el modelo nativo de dosis continua de BioCenicana asumiendo un entorno decaploide (10x); (2) un modelo de dosis discretizada, donde los valores probabilísticos de la máxima verosimilitud fueron redondeados a números enteros para simular herramientas de ploidía rígida; y (3) el modelo diploide (2x) inherente a PopLDdecay. Este diseño metodológico permitió aislar y cuantificar matemáticamente el grado de distorsión que sufre la arquitectura genómica de la caña de azúcar cuando las herramientas bioinformáticas desestiman su naturaleza polisómica cuantitativa.</w:t>
+        <w:t xml:space="preserve">Para maximizar la precisión, el módulo utiliza el método</w:t>
+      </w:r>
+      <w:r>
+        <w:t xml:space="preserve"> </w:t>
+      </w:r>
+      <w:r>
+        <w:rPr>
+          <w:b/>
+          <w:bCs/>
+        </w:rPr>
+        <w:t xml:space="preserve">LOCO (Leave-One-Chromosome-Out)</w:t>
+      </w:r>
+      <w:r>
+        <w:t xml:space="preserve">. Este enfoque calcula una matriz de parentesco específica para cada cromosoma, excluyendo los marcadores del cromosoma que se está analizando en ese momento. Esto evita que la señal del QTL sea</w:t>
+      </w:r>
+      <w:r>
+        <w:t xml:space="preserve"> </w:t>
+      </w:r>
+      <w:r>
+        <w:t xml:space="preserve">“borrada”</w:t>
+      </w:r>
+      <w:r>
+        <w:t xml:space="preserve"> </w:t>
+      </w:r>
+      <w:r>
+        <w:t xml:space="preserve">por la corrección del modelo, aumentando significativamente la potencia para detectar asociaciones verdaderas. Además, BioJava permite el uso de</w:t>
+      </w:r>
+      <w:r>
+        <w:t xml:space="preserve"> </w:t>
+      </w:r>
+      <w:r>
+        <w:rPr>
+          <w:b/>
+          <w:bCs/>
+        </w:rPr>
+        <w:t xml:space="preserve">BLUPs (Best Linear Unbiased Predictors)</w:t>
+      </w:r>
+      <w:r>
+        <w:t xml:space="preserve"> </w:t>
+      </w:r>
+      <w:r>
+        <w:t xml:space="preserve">como entrada fenotípica, lo que reduce el ruido ambiental y se enfoca puramente en el componente genético del rasgo.</w:t>
       </w:r>
     </w:p>
     <w:p>
@@ -4045,9 +4111,10 @@
         </w:pict>
       </w:r>
     </w:p>
+    <w:bookmarkEnd w:id="17"/>
     <w:bookmarkEnd w:id="18"/>
     <w:bookmarkEnd w:id="19"/>
-    <w:bookmarkStart w:id="30" w:name="resultados"/>
+    <w:bookmarkStart w:id="31" w:name="resultados"/>
     <w:p>
       <w:pPr>
         <w:pStyle w:val="Heading2"/>
@@ -4110,7 +4177,7 @@
         <w:t xml:space="preserve"> </w:t>
       </w:r>
       <w:r>
-        <w:t xml:space="preserve">secuencial de BioCenicana fueron evaluados frente a la herramienta NGSEP (versión 5.1.0). El</w:t>
+        <w:t xml:space="preserve">secuencial de BioJava fueron evaluados frente a la herramienta NGSEP (versión 5.1.0). El</w:t>
       </w:r>
       <w:r>
         <w:t xml:space="preserve"> </w:t>
@@ -4159,7 +4226,7 @@
         <w:t xml:space="preserve">vcf-stats</w:t>
       </w:r>
       <w:r>
-        <w:t xml:space="preserve">), BioCenicana completó el perfilamiento estadístico en 2.37 segundos, resultando en una aceleración de 7.1x frente a los 17.02 segundos requeridos por NGSEP. Este incremento significativo en la velocidad no comprometió la exactitud matemática: se obtuvo una coincidencia absoluta del 100% en el conteo total de variantes y en las proporciones de transiciones/transversiones (Tabla 1).</w:t>
+        <w:t xml:space="preserve">), BioJava completó el perfilamiento estadístico en 2.37 segundos, resultando en una aceleración de 7.1x frente a los 17.02 segundos requeridos por NGSEP. Este incremento significativo en la velocidad no comprometió la exactitud matemática: se obtuvo una coincidencia absoluta del 100% en el conteo total de variantes y en las proporciones de transiciones/transversiones (Tabla 1).</w:t>
       </w:r>
     </w:p>
     <w:p>
@@ -4192,7 +4259,7 @@
         <w:t xml:space="preserve"> </w:t>
       </w:r>
       <w:r>
-        <w:t xml:space="preserve">| Métrica | BioCenicana (4 núcleos) | NGSEP 5.1.0 | Coincidencia |</w:t>
+        <w:t xml:space="preserve">| Métrica | BioJava (4 núcleos) | NGSEP 5.1.0 | Coincidencia |</w:t>
       </w:r>
       <w:r>
         <w:t xml:space="preserve"> </w:t>
@@ -4332,7 +4399,7 @@
         <w:pStyle w:val="BodyText"/>
       </w:pPr>
       <w:r>
-        <w:t xml:space="preserve">La eficiencia arquitectónica de BioCenicana se hizo aún más evidente durante la fase de depuración activa (</w:t>
+        <w:t xml:space="preserve">La eficiencia arquitectónica de BioJava se hizo aún más evidente durante la fase de depuración activa (</w:t>
       </w:r>
       <w:r>
         <w:rPr>
@@ -4341,7 +4408,7 @@
         <w:t xml:space="preserve">vcf-filter</w:t>
       </w:r>
       <w:r>
-        <w:t xml:space="preserve">). Al aplicar umbrales paramétricos estrictos (frecuencia de alelo menor MAF ≥ 0.05, tolerancia de datos faltantes ≤ 20%, y profundidad mínima ≥ 20X), el motor de procesamiento paralelo de BioCenicana procesó y exportó el archivo filtrado en tan solo 1.85 segundos. En contraposición, NGSEP requirió 121.97 segundos para completar la misma operación, lo que evidencia una aceleración masiva de 65x a favor de BioCenicana (Tabla 2).</w:t>
+        <w:t xml:space="preserve">). Al aplicar umbrales paramétricos estrictos (frecuencia de alelo menor MAF ≥ 0.05, tolerancia de datos faltantes ≤ 20%, y profundidad mínima ≥ 20X), el motor de procesamiento paralelo de BioJava procesó y exportó el archivo filtrado en tan solo 1.85 segundos. En contraposición, NGSEP requirió 121.97 segundos para completar la misma operación, lo que evidencia una aceleración masiva de 65x a favor de BioJava (Tabla 2).</w:t>
       </w:r>
     </w:p>
     <w:p>
@@ -4365,7 +4432,7 @@
         <w:t xml:space="preserve"> </w:t>
       </w:r>
       <w:r>
-        <w:t xml:space="preserve">paralelo de BioCenicana es capaz de sortear los característicos cuellos de botella de entrada/salida (I/O) y consumo de memoria RAM asociados a la genómica de poblaciones, garantizando simultáneamente una fidelidad y coincidencia de resultados del 100% frente a estándares consolidados de la industria.</w:t>
+        <w:t xml:space="preserve">paralelo de BioJava es capaz de sortear los característicos cuellos de botella de entrada/salida (I/O) y consumo de memoria RAM asociados a la genómica de poblaciones, garantizando simultáneamente una fidelidad y coincidencia de resultados del 100% frente a estándares consolidados de la industria.</w:t>
       </w:r>
     </w:p>
     <w:p>
@@ -4408,7 +4475,7 @@
         <w:t xml:space="preserve"> </w:t>
       </w:r>
       <w:r>
-        <w:t xml:space="preserve">| Métrica | BioCenicana (Parallel) | NGSEP 5.1.0 | Coincidencia |</w:t>
+        <w:t xml:space="preserve">| Métrica | BioJava (Parallel) | NGSEP 5.1.0 | Coincidencia |</w:t>
       </w:r>
       <w:r>
         <w:t xml:space="preserve"> </w:t>
@@ -4578,7 +4645,7 @@
         <w:t xml:space="preserve"> </w:t>
       </w:r>
       <w:r>
-        <w:t xml:space="preserve">cuando se desestima su naturaleza polisómica, se estructuró un análisis comparativo calculando el decaimiento del Desequilibrio de Ligamiento (LD) bajo tres restricciones matemáticas distintas: el modelo de dosis continua (ploidía 10) de BioCenicana, un modelo de dosis discretizada (ploidía 2) de BioCenicana, y el modelo estándar de genotipos discretos diploides inherente a PopLDdecay.</w:t>
+        <w:t xml:space="preserve">cuando se desestima su naturaleza polisómica, se estructuró un análisis comparativo calculando el decaimiento del Desequilibrio de Ligamiento (LD) bajo tres restricciones matemáticas distintas: el modelo de dosis continua (ploidía 10) de BioJava, un modelo de dosis discretizada (ploidía 2) de BioJava, y el modelo estándar de genotipos discretos diploides inherente a PopLDdecay.</w:t>
       </w:r>
     </w:p>
     <w:p>
@@ -4586,7 +4653,7 @@
         <w:pStyle w:val="BodyText"/>
       </w:pPr>
       <w:r>
-        <w:t xml:space="preserve">Los resultados (Tabla 3) demostraron que la subestimación de la ploidía genera un sesgo matemático y biológico severo. El motor nativo de BioCenicana, al emplear la dosis alélica real bajo un entorno decaploide, procesó la matriz en 1.12 segundos, detectando un valor de asociación máximo (r²) de 0.4172. Lo más destacable fue la identificación de un decaimiento rápido del bloque haplotípico a la mitad de su valor inicial, ocurriendo aproximadamente a los 1,000 pares de bases (bp). Este rápido decaimiento es biológicamente congruente con el gran tamaño del genoma y las altas tasas de recombinación histórica en el género</w:t>
+        <w:t xml:space="preserve">Los resultados (Tabla 3) demostraron que la subestimación de la ploidía genera un sesgo matemático y biológico severo. El motor nativo de BioJava, al emplear la dosis alélica real bajo un entorno decaploide, procesó la matriz en 1.12 segundos, detectando un valor de asociación máximo (r²) de 0.4172. Lo más destacable fue la identificación de un decaimiento rápido del bloque haplotípico a la mitad de su valor inicial, ocurriendo aproximadamente a los 1,000 pares de bases (bp). Este rápido decaimiento es biológicamente congruente con el gran tamaño del genoma y las altas tasas de recombinación histórica en el género</w:t>
       </w:r>
       <w:r>
         <w:t xml:space="preserve"> </w:t>
@@ -4625,7 +4692,7 @@
         <w:t xml:space="preserve"> </w:t>
       </w:r>
       <w:r>
-        <w:t xml:space="preserve">| Parámetro | BioCenicana (Ploidía 10) | BioCenicana (Ploidía 2) | PopLDdecay (Diploide) |</w:t>
+        <w:t xml:space="preserve">| Parámetro | BioJava (Ploidía 10) | BioJava (Ploidía 2) | PopLDdecay (Diploide) |</w:t>
       </w:r>
       <w:r>
         <w:t xml:space="preserve"> </w:t>
@@ -4810,7 +4877,7 @@
         <w:pStyle w:val="FirstParagraph"/>
       </w:pPr>
       <w:r>
-        <w:t xml:space="preserve">El análisis de la estructura poblacional en poliploides presenta un desafío analítico donde convergen la viabilidad computacional y la fidelidad biológica. Mediante la ejecución de pruebas de rendimiento estandarizadas, BioCenicana procesó la matriz genotípica del panel completo en</w:t>
+        <w:t xml:space="preserve">El análisis de la estructura poblacional en poliploides presenta un desafío analítico donde convergen la viabilidad computacional y la fidelidad biológica. Mediante la ejecución de pruebas de rendimiento estandarizadas, BioJava procesó la matriz genotípica del panel completo en</w:t>
       </w:r>
       <w:r>
         <w:t xml:space="preserve"> </w:t>
@@ -4924,7 +4991,7 @@
         <w:t xml:space="preserve"> </w:t>
       </w:r>
       <w:r>
-        <w:t xml:space="preserve">—más del doble que BioCenicana— para generar únicamente una matriz de distancia en formato de texto plano. NGSEP carece de integración nativa para la reducción de dimensionalidad (PCA), la identificación de clústeres no supervisados o el cálculo estandarizado de la matriz de parentesco de VanRaden. Esto obliga a los investigadores a recurrir a lenguajes adicionales para completar el flujo poblacional, fragmentando el análisis.</w:t>
+        <w:t xml:space="preserve">—más del doble que BioJava— para generar únicamente una matriz de distancia en formato de texto plano. NGSEP carece de integración nativa para la reducción de dimensionalidad (PCA), la identificación de clústeres no supervisados o el cálculo estandarizado de la matriz de parentesco de VanRaden. Esto obliga a los investigadores a recurrir a lenguajes adicionales para completar el flujo poblacional, fragmentando el análisis.</w:t>
       </w:r>
     </w:p>
     <w:p>
@@ -4996,7 +5063,7 @@
         <w:t xml:space="preserve"> </w:t>
       </w:r>
       <w:r>
-        <w:t xml:space="preserve">paralelo de BioCenicana elimina este cuello de botella y entrega el flujo analítico poblacional completo de manera casi instantánea, unificando precisión biológica y excelencia computacional.</w:t>
+        <w:t xml:space="preserve">paralelo de BioJava elimina este cuello de botella y entrega el flujo analítico poblacional completo de manera casi instantánea, unificando precisión biológica y excelencia computacional.</w:t>
       </w:r>
     </w:p>
     <w:p>
@@ -5014,7 +5081,7 @@
         <w:t xml:space="preserve"> </w:t>
       </w:r>
       <w:r>
-        <w:t xml:space="preserve">| Métrica / Herramienta | BioCenicana | NGSEP 5.1.0 | Flujo en R (</w:t>
+        <w:t xml:space="preserve">| Métrica / Herramienta | BioJava | NGSEP 5.1.0 | Flujo en R (</w:t>
       </w:r>
       <w:r>
         <w:rPr>
@@ -5167,7 +5234,7 @@
         <w:pStyle w:val="BodyText"/>
       </w:pPr>
       <w:r>
-        <w:t xml:space="preserve">Más allá del rendimiento computacional, la verdadera ventaja de BioCenicana radica en la riqueza de sus resultados biológicos. Mientras que herramientas tradicionales como NGSEP se limitan a exportar una matriz matemática genérica de distancias (sin encabezados ni metadatos) que obliga al usuario a programar el resto del análisis, el motor de BioCenicana realiza de forma nativa la inferencia poblacional completa y exporta un panel estructurado listo para su interpretación evolutiva (Tabla 5).</w:t>
+        <w:t xml:space="preserve">Más allá del rendimiento computacional, la verdadera ventaja de BioJava radica en la riqueza de sus resultados biológicos. Mientras que herramientas tradicionales como NGSEP se limitan a exportar una matriz matemática genérica de distancias (sin encabezados ni metadatos) que obliga al usuario a programar el resto del análisis, el motor de BioJava realiza de forma nativa la inferencia poblacional completa y exporta un panel estructurado listo para su interpretación evolutiva (Tabla 5).</w:t>
       </w:r>
     </w:p>
     <w:p>
@@ -5185,7 +5252,7 @@
         <w:t xml:space="preserve"> </w:t>
       </w:r>
       <w:r>
-        <w:t xml:space="preserve">| Parámetro Biológico | Salida BioCenicana | Salida NGSEP | Aplicación en GWAS y Mejoramiento |</w:t>
+        <w:t xml:space="preserve">| Parámetro Biológico | Salida BioJava | Salida NGSEP | Aplicación en GWAS y Mejoramiento |</w:t>
       </w:r>
       <w:r>
         <w:t xml:space="preserve"> </w:t>
@@ -5352,7 +5419,7 @@
         <w:t xml:space="preserve">Figura 3</w:t>
       </w:r>
       <w:r>
-        <w:t xml:space="preserve">, BioCenicana proporciona una evaluación jerárquica de la estructura genética sin requerir visualizadores externos. El análisis de la varianza explicada (</w:t>
+        <w:t xml:space="preserve">, BioJava proporciona una evaluación jerárquica de la estructura genética sin requerir visualizadores externos. El análisis de la varianza explicada (</w:t>
       </w:r>
       <w:r>
         <w:rPr>
@@ -5808,7 +5875,7 @@
         <w:t xml:space="preserve"> </w:t>
       </w:r>
       <w:r>
-        <w:t xml:space="preserve">El archivo HTML generado nativamente por BioCenicana, que contiene el modelo tridimensional rotatorio y los metadatos completos del análisis poblacional, está disponible para su exploración interactiva como Material Suplementario en el siguiente enlace web:</w:t>
+        <w:t xml:space="preserve">El archivo HTML generado nativamente por BioJava, que contiene el modelo tridimensional rotatorio y los metadatos completos del análisis poblacional, está disponible para su exploración interactiva como Material Suplementario en el siguiente enlace web:</w:t>
       </w:r>
       <w:r>
         <w:t xml:space="preserve"> </w:t>
@@ -5864,7 +5931,7 @@
         <w:t xml:space="preserve"> </w:t>
       </w:r>
       <w:r>
-        <w:t xml:space="preserve">de BioCenicana aborda este reto calculando una matriz de distancia euclidiana por pares basada en las profundidades relativas de los alelos y, subsecuentemente, reconstruyendo la topología poblacional mediante el algoritmo aglomerativo de</w:t>
+        <w:t xml:space="preserve">de BioJava aborda este reto calculando una matriz de distancia euclidiana por pares basada en las profundidades relativas de los alelos y, subsecuentemente, reconstruyendo la topología poblacional mediante el algoritmo aglomerativo de</w:t>
       </w:r>
       <w:r>
         <w:t xml:space="preserve"> </w:t>
@@ -5953,7 +6020,7 @@
         <w:t xml:space="preserve"> </w:t>
       </w:r>
       <w:r>
-        <w:t xml:space="preserve">de BioCenicana ejecutó el flujo analítico de principio a fin en tan solo</w:t>
+        <w:t xml:space="preserve">de BioJava ejecutó el flujo analítico de principio a fin en tan solo</w:t>
       </w:r>
       <w:r>
         <w:t xml:space="preserve"> </w:t>
@@ -6009,7 +6076,7 @@
         <w:t xml:space="preserve"> </w:t>
       </w:r>
       <w:r>
-        <w:t xml:space="preserve">| Métrica Operativa | BioCenicana (</w:t>
+        <w:t xml:space="preserve">| Métrica Operativa | BioJava (</w:t>
       </w:r>
       <w:r>
         <w:rPr>
@@ -6173,7 +6240,7 @@
         <w:t xml:space="preserve"> </w:t>
       </w:r>
       <w:r>
-        <w:t xml:space="preserve">radica en su integración ecosistémica. BioCenicana permite la inyección directa de los resultados poblacionales previos en la reconstrucción filogenética (mediante el parámetro</w:t>
+        <w:t xml:space="preserve">radica en su integración ecosistémica. BioJava permite la inyección directa de los resultados poblacionales previos en la reconstrucción filogenética (mediante el parámetro</w:t>
       </w:r>
       <w:r>
         <w:t xml:space="preserve"> </w:t>
@@ -6307,7 +6374,7 @@
         <w:t xml:space="preserve"> </w:t>
       </w:r>
       <w:r>
-        <w:t xml:space="preserve">Las imágenes estáticas (Figura 5) son extraídas del módulo nativo de BioCenicana. El visor interactivo original está disponible públicamente en</w:t>
+        <w:t xml:space="preserve">Las imágenes estáticas (Figura 5) son extraídas del módulo nativo de BioJava. El visor interactivo original está disponible públicamente en</w:t>
       </w:r>
       <w:r>
         <w:t xml:space="preserve"> </w:t>
@@ -6375,7 +6442,7 @@
         <w:t xml:space="preserve"> </w:t>
       </w:r>
       <w:r>
-        <w:t xml:space="preserve">de BioCenicana soluciona esta limitación implementando un modelo que computa la correlación alélica (</w:t>
+        <w:t xml:space="preserve">de BioJava soluciona esta limitación implementando un modelo que computa la correlación alélica (</w:t>
       </w:r>
       <m:oMath>
         <m:sSup>
@@ -6416,7 +6483,7 @@
         <w:t xml:space="preserve"> </w:t>
       </w:r>
       <w:r>
-        <w:t xml:space="preserve">(reportando caídas a los ~6,000 pb), el análisis de dosis continua de BioCenicana demuestra un decaimiento del LD muchísimo más acelerado, cayendo rápidamente en los primeros</w:t>
+        <w:t xml:space="preserve">(reportando caídas a los ~6,000 pb), el análisis de dosis continua de BioJava demuestra un decaimiento del LD muchísimo más acelerado, cayendo rápidamente en los primeros</w:t>
       </w:r>
       <w:r>
         <w:t xml:space="preserve"> </w:t>
@@ -6513,7 +6580,7 @@
         <w:t xml:space="preserve"> </w:t>
       </w:r>
       <w:r>
-        <w:t xml:space="preserve">La visualización estática de la Figura 7 fue extraída del dashboard estadístico autogenerado por BioCenicana. El visor interactivo original está disponible públicamente en</w:t>
+        <w:t xml:space="preserve">La visualización estática de la Figura 7 fue extraída del dashboard estadístico autogenerado por BioJava. El visor interactivo original está disponible públicamente en</w:t>
       </w:r>
       <w:r>
         <w:t xml:space="preserve"> </w:t>
@@ -6677,7 +6744,7 @@
                 <w:b/>
                 <w:bCs/>
               </w:rPr>
-              <w:t xml:space="preserve">BioCenicana (</w:t>
+              <w:t xml:space="preserve">BioJava (</w:t>
             </w:r>
             <w:r>
               <w:rPr>
@@ -7011,13 +7078,13 @@
           <w:b/>
           <w:bCs/>
         </w:rPr>
-        <w:t xml:space="preserve">La Precisión de BioCenicana:</w:t>
-      </w:r>
-      <w:r>
-        <w:t xml:space="preserve"> </w:t>
-      </w:r>
-      <w:r>
-        <w:t xml:space="preserve">La arquitectura de BioCenicana evita por completo la asignación discreta. En su lugar, extrae las profundidades alélicas relativas (Continuous Dosage) directamente del archivo VCF para crear un vector de probabilidad continua (valores entre 0.0 y 1.0) para cada individuo. Al calcular el</w:t>
+        <w:t xml:space="preserve">La Precisión de BioJava:</w:t>
+      </w:r>
+      <w:r>
+        <w:t xml:space="preserve"> </w:t>
+      </w:r>
+      <w:r>
+        <w:t xml:space="preserve">La arquitectura de BioJava evita por completo la asignación discreta. En su lugar, extrae las profundidades alélicas relativas (Continuous Dosage) directamente del archivo VCF para crear un vector de probabilidad continua (valores entre 0.0 y 1.0) para cada individuo. Al calcular el</w:t>
       </w:r>
       <w:r>
         <w:t xml:space="preserve"> </w:t>
@@ -7040,7 +7107,7 @@
         <w:t xml:space="preserve"> </w:t>
       </w:r>
       <w:r>
-        <w:t xml:space="preserve">sobre espectros continuos, BioCenicana preserva la totalidad de la varianza biológica. Como resultado, captura los eventos de recombinación sutiles que las otras herramientas ignoran, revelando la verdadera arquitectura genética de la caña de azúcar: un genoma altamente fracturado donde el desequilibrio de ligamiento decae rápidamente en los primeros ~1,000 pb.</w:t>
+        <w:t xml:space="preserve">sobre espectros continuos, BioJava preserva la totalidad de la varianza biológica. Como resultado, captura los eventos de recombinación sutiles que las otras herramientas ignoran, revelando la verdadera arquitectura genética de la caña de azúcar: un genoma altamente fracturado donde el desequilibrio de ligamiento decae rápidamente en los primeros ~1,000 pb.</w:t>
       </w:r>
     </w:p>
     <w:p>
@@ -7052,12 +7119,386 @@
       </w:r>
     </w:p>
     <w:bookmarkEnd w:id="27"/>
-    <w:bookmarkStart w:id="29" w:name="Xf965b3927433f1768530ef8e7023746e404bca5"/>
+    <w:bookmarkStart w:id="28" w:name="Xc6d8196eed46605f68e389eebaf2a2dadb99199"/>
     <w:p>
       <w:pPr>
         <w:pStyle w:val="Heading3"/>
       </w:pPr>
       <w:r>
+        <w:t xml:space="preserve">Estudios de Asociación de Genoma Completo (GWAS)</w:t>
+      </w:r>
+    </w:p>
+    <w:p>
+      <w:pPr>
+        <w:pStyle w:val="FirstParagraph"/>
+      </w:pPr>
+      <w:r>
+        <w:t xml:space="preserve">Se realizaron estudios de asociación para las características de</w:t>
+      </w:r>
+      <w:r>
+        <w:t xml:space="preserve"> </w:t>
+      </w:r>
+      <w:r>
+        <w:rPr>
+          <w:b/>
+          <w:bCs/>
+        </w:rPr>
+        <w:t xml:space="preserve">Severidad</w:t>
+      </w:r>
+      <w:r>
+        <w:t xml:space="preserve"> </w:t>
+      </w:r>
+      <w:r>
+        <w:t xml:space="preserve">y</w:t>
+      </w:r>
+      <w:r>
+        <w:t xml:space="preserve"> </w:t>
+      </w:r>
+      <w:r>
+        <w:rPr>
+          <w:b/>
+          <w:bCs/>
+        </w:rPr>
+        <w:t xml:space="preserve">Reacción</w:t>
+      </w:r>
+      <w:r>
+        <w:t xml:space="preserve"> </w:t>
+      </w:r>
+      <w:r>
+        <w:t xml:space="preserve">a la enfermedad utilizando los BLUPs calculados para la población CC 01-1940. El análisis integró 13,590 variantes genéticas distribuidas en los 10 cromosomas (o grupos de ligamiento) de la población.</w:t>
+      </w:r>
+    </w:p>
+    <w:p>
+      <w:pPr>
+        <w:pStyle w:val="BodyText"/>
+      </w:pPr>
+      <w:r>
+        <w:t xml:space="preserve">El modelo EMMAX-LOCO demostró una excelente capacidad de control sobre la inflación estadística, reportando valores de</w:t>
+      </w:r>
+      <w:r>
+        <w:t xml:space="preserve"> </w:t>
+      </w:r>
+      <w:r>
+        <w:rPr>
+          <w:b/>
+          <w:bCs/>
+        </w:rPr>
+        <w:t xml:space="preserve">Lambda GC de 1.173</w:t>
+      </w:r>
+      <w:r>
+        <w:t xml:space="preserve"> </w:t>
+      </w:r>
+      <w:r>
+        <w:t xml:space="preserve">para Severidad y</w:t>
+      </w:r>
+      <w:r>
+        <w:t xml:space="preserve"> </w:t>
+      </w:r>
+      <w:r>
+        <w:rPr>
+          <w:b/>
+          <w:bCs/>
+        </w:rPr>
+        <w:t xml:space="preserve">1.355</w:t>
+      </w:r>
+      <w:r>
+        <w:t xml:space="preserve"> </w:t>
+      </w:r>
+      <w:r>
+        <w:t xml:space="preserve">para Reacción. Como se observa en los gráficos QQ-plot, la distribución de los p-values observados sigue estrechamente la distribución esperada, sugiriendo la presencia de señales genéticas reales.</w:t>
+      </w:r>
+    </w:p>
+    <w:p>
+      <w:pPr>
+        <w:pStyle w:val="BodyText"/>
+      </w:pPr>
+      <w:r>
+        <w:t xml:space="preserve">Para la característica de</w:t>
+      </w:r>
+      <w:r>
+        <w:t xml:space="preserve"> </w:t>
+      </w:r>
+      <w:r>
+        <w:rPr>
+          <w:b/>
+          <w:bCs/>
+        </w:rPr>
+        <w:t xml:space="preserve">Reacción</w:t>
+      </w:r>
+      <w:r>
+        <w:t xml:space="preserve">, se detectó un marcador altamente significativo en el</w:t>
+      </w:r>
+      <w:r>
+        <w:t xml:space="preserve"> </w:t>
+      </w:r>
+      <w:r>
+        <w:rPr>
+          <w:b/>
+          <w:bCs/>
+        </w:rPr>
+        <w:t xml:space="preserve">contig_53619:1152</w:t>
+      </w:r>
+      <w:r>
+        <w:t xml:space="preserve"> </w:t>
+      </w:r>
+      <w:r>
+        <w:t xml:space="preserve">(</w:t>
+      </w:r>
+      <m:oMath>
+        <m:r>
+          <m:t>p</m:t>
+        </m:r>
+        <m:r>
+          <m:rPr>
+            <m:sty m:val="p"/>
+          </m:rPr>
+          <m:t>=</m:t>
+        </m:r>
+        <m:r>
+          <m:t>2.29</m:t>
+        </m:r>
+        <m:r>
+          <m:rPr>
+            <m:sty m:val="p"/>
+          </m:rPr>
+          <m:t>×</m:t>
+        </m:r>
+        <m:sSup>
+          <m:e>
+            <m:r>
+              <m:t>10</m:t>
+            </m:r>
+          </m:e>
+          <m:sup>
+            <m:r>
+              <m:rPr>
+                <m:sty m:val="p"/>
+              </m:rPr>
+              <m:t>−</m:t>
+            </m:r>
+            <m:r>
+              <m:t>6</m:t>
+            </m:r>
+          </m:sup>
+        </m:sSup>
+      </m:oMath>
+      <w:r>
+        <w:t xml:space="preserve">), el cual superó el umbral de Bonferroni (</w:t>
+      </w:r>
+      <m:oMath>
+        <m:r>
+          <m:t>5.43</m:t>
+        </m:r>
+      </m:oMath>
+      <w:r>
+        <w:t xml:space="preserve">). Adicionalmente, se identificó una señal consistente en el</w:t>
+      </w:r>
+      <w:r>
+        <w:t xml:space="preserve"> </w:t>
+      </w:r>
+      <w:r>
+        <w:rPr>
+          <w:b/>
+          <w:bCs/>
+        </w:rPr>
+        <w:t xml:space="preserve">Cromosoma 10</w:t>
+      </w:r>
+      <w:r>
+        <w:t xml:space="preserve"> </w:t>
+      </w:r>
+      <w:r>
+        <w:t xml:space="preserve">(</w:t>
+      </w:r>
+      <m:oMath>
+        <m:r>
+          <m:rPr>
+            <m:sty m:val="p"/>
+          </m:rPr>
+          <m:t>−</m:t>
+        </m:r>
+        <m:sSub>
+          <m:e>
+            <m:r>
+              <m:rPr>
+                <m:sty m:val="p"/>
+              </m:rPr>
+              <m:t>log</m:t>
+            </m:r>
+          </m:e>
+          <m:sub>
+            <m:r>
+              <m:t>10</m:t>
+            </m:r>
+          </m:sub>
+        </m:sSub>
+        <m:r>
+          <m:rPr>
+            <m:sty m:val="p"/>
+          </m:rPr>
+          <m:t>(</m:t>
+        </m:r>
+        <m:r>
+          <m:t>p</m:t>
+        </m:r>
+        <m:r>
+          <m:rPr>
+            <m:sty m:val="p"/>
+          </m:rPr>
+          <m:t>)</m:t>
+        </m:r>
+        <m:r>
+          <m:rPr>
+            <m:sty m:val="p"/>
+          </m:rPr>
+          <m:t>≈</m:t>
+        </m:r>
+        <m:r>
+          <m:t>3.96</m:t>
+        </m:r>
+      </m:oMath>
+      <w:r>
+        <w:t xml:space="preserve">).</w:t>
+      </w:r>
+    </w:p>
+    <w:p>
+      <w:pPr>
+        <w:pStyle w:val="BodyText"/>
+      </w:pPr>
+      <w:r>
+        <w:t xml:space="preserve">Un hallazgo de gran relevancia biológica fue la detección de</w:t>
+      </w:r>
+      <w:r>
+        <w:t xml:space="preserve"> </w:t>
+      </w:r>
+      <w:r>
+        <w:rPr>
+          <w:b/>
+          <w:bCs/>
+        </w:rPr>
+        <w:t xml:space="preserve">pleiotropía</w:t>
+      </w:r>
+      <w:r>
+        <w:t xml:space="preserve"> </w:t>
+      </w:r>
+      <w:r>
+        <w:t xml:space="preserve">en el</w:t>
+      </w:r>
+      <w:r>
+        <w:t xml:space="preserve"> </w:t>
+      </w:r>
+      <w:r>
+        <w:rPr>
+          <w:b/>
+          <w:bCs/>
+        </w:rPr>
+        <w:t xml:space="preserve">Cromosoma 10</w:t>
+      </w:r>
+      <w:r>
+        <w:t xml:space="preserve">. Para la característica de</w:t>
+      </w:r>
+      <w:r>
+        <w:t xml:space="preserve"> </w:t>
+      </w:r>
+      <w:r>
+        <w:rPr>
+          <w:b/>
+          <w:bCs/>
+        </w:rPr>
+        <w:t xml:space="preserve">Severidad</w:t>
+      </w:r>
+      <w:r>
+        <w:t xml:space="preserve">, se identificó un pico prominente en la misma región del Cromosoma 10 (</w:t>
+      </w:r>
+      <m:oMath>
+        <m:r>
+          <m:rPr>
+            <m:sty m:val="p"/>
+          </m:rPr>
+          <m:t>−</m:t>
+        </m:r>
+        <m:sSub>
+          <m:e>
+            <m:r>
+              <m:rPr>
+                <m:sty m:val="p"/>
+              </m:rPr>
+              <m:t>log</m:t>
+            </m:r>
+          </m:e>
+          <m:sub>
+            <m:r>
+              <m:t>10</m:t>
+            </m:r>
+          </m:sub>
+        </m:sSub>
+        <m:r>
+          <m:rPr>
+            <m:sty m:val="p"/>
+          </m:rPr>
+          <m:t>(</m:t>
+        </m:r>
+        <m:r>
+          <m:t>p</m:t>
+        </m:r>
+        <m:r>
+          <m:rPr>
+            <m:sty m:val="p"/>
+          </m:rPr>
+          <m:t>)</m:t>
+        </m:r>
+        <m:r>
+          <m:rPr>
+            <m:sty m:val="p"/>
+          </m:rPr>
+          <m:t>≈</m:t>
+        </m:r>
+        <m:r>
+          <m:t>4.3</m:t>
+        </m:r>
+      </m:oMath>
+      <w:r>
+        <w:t xml:space="preserve">). La coincidencia de picos de asociación para ambos rasgos en el Cromosoma 10 sugiere que esta región genómica alberga genes clave que confieren una resistencia integral, afectando tanto la colonización inicial del patógeno (reacción) como el desarrollo posterior de los síntomas (severidad). Estos resultados validan la potencia de BioJava para detectar loci de efecto moderado en poliploides complejos y proporcionan marcadores candidatos robustos para la selección asistida.</w:t>
+      </w:r>
+    </w:p>
+    <w:p>
+      <w:pPr>
+        <w:pStyle w:val="BodyText"/>
+      </w:pPr>
+      <w:r>
+        <w:rPr>
+          <w:b/>
+          <w:bCs/>
+        </w:rPr>
+        <w:t xml:space="preserve">Figura 8. Análisis GWAS para Severidad y Reacción (BLUPs) en la población 1940.</w:t>
+      </w:r>
+    </w:p>
+    <w:p>
+      <w:pPr>
+        <w:pStyle w:val="BodyText"/>
+      </w:pPr>
+      <w:r>
+        <w:t xml:space="preserve"> </w:t>
+      </w:r>
+      <w:r>
+        <w:t xml:space="preserve"> </w:t>
+      </w:r>
+      <w:r>
+        <w:t xml:space="preserve">Manhattan Plot y QQ-Plot (Severidad):</w:t>
+      </w:r>
+      <w:r>
+        <w:t xml:space="preserve"> </w:t>
+      </w:r>
+      <w:r>
+        <w:t xml:space="preserve">Visualización de la asociación genómica. El pico en el Cromosoma 10 representa la región candidata más fuerte.</w:t>
+      </w:r>
+    </w:p>
+    <w:bookmarkEnd w:id="28"/>
+    <w:bookmarkStart w:id="30" w:name="Xf965b3927433f1768530ef8e7023746e404bca5"/>
+    <w:p>
+      <w:pPr>
+        <w:pStyle w:val="Heading3"/>
+      </w:pPr>
+      <w:r>
         <w:t xml:space="preserve">Genómica Comparativa y Evolución Funcional (</w:t>
       </w:r>
       <w:r>
@@ -7105,7 +7546,7 @@
         <w:t xml:space="preserve"> </w:t>
       </w:r>
       <w:r>
-        <w:t xml:space="preserve">de BioCenicana cierra esta brecha operativa al superponer, en un único ecosistema algorítmico, datos de colinealidad estructural (derivados de herramientas como McScanX o SynMap), mapas de anotación genómica (GFF3) y datos de diversidad poblacional profunda (VCF).</w:t>
+        <w:t xml:space="preserve">de BioJava cierra esta brecha operativa al superponer, en un único ecosistema algorítmico, datos de colinealidad estructural (derivados de herramientas como McScanX o SynMap), mapas de anotación genómica (GFF3) y datos de diversidad poblacional profunda (VCF).</w:t>
       </w:r>
     </w:p>
     <w:p>
@@ -7162,7 +7603,7 @@
         <w:pStyle w:val="BodyText"/>
       </w:pPr>
       <w:r>
-        <w:t xml:space="preserve">Para complementar la genómica estructural con una métrica pura de presión selectiva, BioCenicana incluye el submódulo</w:t>
+        <w:t xml:space="preserve">Para complementar la genómica estructural con una métrica pura de presión selectiva, BioJava incluye el submódulo</w:t>
       </w:r>
       <w:r>
         <w:t xml:space="preserve"> </w:t>
@@ -7189,337 +7630,62 @@
         <w:t xml:space="preserve">Figura 6. Dashboard Interactivo de Sintenia, Genómica Estructural y Dinámica Evolutiva.</w:t>
       </w:r>
     </w:p>
-    <w:tbl>
-      <w:tblPr>
-        <w:tblStyle w:val="Table"/>
-        <w:tblW w:type="pct" w:w="5000"/>
-        <w:tblLayout w:type="fixed"/>
-        <w:tblLook w:firstRow="1" w:lastRow="0" w:firstColumn="0" w:lastColumn="0" w:noHBand="0" w:noVBand="0" w:val="0020"/>
-      </w:tblPr>
-      <w:tblGrid>
-        <w:gridCol w:w="3960"/>
-        <w:gridCol w:w="3960"/>
-      </w:tblGrid>
-      <w:tr>
-        <w:trPr>
-          <w:tblHeader w:val="on"/>
-        </w:trPr>
-        <w:tc>
-          <w:tcPr/>
-          <w:p>
-            <w:pPr>
-              <w:pStyle w:val="Compact"/>
-              <w:jc w:val="center"/>
-            </w:pPr>
-            <w:r>
-              <w:t xml:space="preserve">Pan-genoma</w:t>
-            </w:r>
-          </w:p>
-        </w:tc>
-        <w:tc>
-          <w:tcPr/>
-          <w:p>
-            <w:pPr>
-              <w:pStyle w:val="Compact"/>
-              <w:jc w:val="center"/>
-            </w:pPr>
-            <w:r>
-              <w:t xml:space="preserve">Filtro Base</w:t>
-            </w:r>
-          </w:p>
-        </w:tc>
-      </w:tr>
-      <w:tr>
-        <w:tc>
-          <w:tcPr/>
-          <w:p>
-            <w:pPr>
-              <w:pStyle w:val="Compact"/>
-              <w:jc w:val="center"/>
-            </w:pPr>
-            <w:r>
-              <w:t xml:space="preserve">(A) Macro-Sintenia Pan-genómica:</w:t>
-            </w:r>
-            <w:r>
-              <w:t xml:space="preserve"> </w:t>
-            </w:r>
-            <w:r>
-              <w:t xml:space="preserve">Mapeo masivo de genomas completos (&gt;110k genes cruzados).</w:t>
-            </w:r>
-          </w:p>
-        </w:tc>
-        <w:tc>
-          <w:tcPr/>
-          <w:p>
-            <w:pPr>
-              <w:pStyle w:val="Compact"/>
-              <w:jc w:val="center"/>
-            </w:pPr>
-            <w:r>
-              <w:t xml:space="preserve">(B) Filtrado Estructural Dinámico:</w:t>
-            </w:r>
-            <w:r>
-              <w:t xml:space="preserve"> </w:t>
-            </w:r>
-            <w:r>
-              <w:t xml:space="preserve">Aislamiento de regiones sinténicas mediante selección de secuencias homólogas.</w:t>
-            </w:r>
-          </w:p>
-        </w:tc>
-      </w:tr>
-      <w:tr>
-        <w:tc>
-          <w:tcPr/>
-          <w:p>
-            <w:pPr>
-              <w:pStyle w:val="Compact"/>
-              <w:jc w:val="center"/>
-            </w:pPr>
-            <w:r>
-              <w:t xml:space="preserve">Filtro Estricto y Tooltips</w:t>
-            </w:r>
-          </w:p>
-        </w:tc>
-        <w:tc>
-          <w:tcPr/>
-          <w:p>
-            <w:pPr>
-              <w:pStyle w:val="Compact"/>
-              <w:jc w:val="center"/>
-            </w:pPr>
-            <w:r>
-              <w:t xml:space="preserve">Alineación de Subgenomas</w:t>
-            </w:r>
-          </w:p>
-        </w:tc>
-      </w:tr>
-      <w:tr>
-        <w:tc>
-          <w:tcPr/>
-          <w:p>
-            <w:pPr>
-              <w:pStyle w:val="Compact"/>
-              <w:jc w:val="center"/>
-            </w:pPr>
-            <w:r>
-              <w:t xml:space="preserve">(C) Depuración de Ruido e Interactividad:</w:t>
-            </w:r>
-            <w:r>
-              <w:t xml:space="preserve"> </w:t>
-            </w:r>
-            <w:r>
-              <w:t xml:space="preserve">Aplicación de umbrales altos de conservación y extracción</w:t>
-            </w:r>
-            <w:r>
-              <w:t xml:space="preserve"> </w:t>
-            </w:r>
-            <w:r>
-              <w:rPr>
-                <w:i/>
-                <w:iCs/>
-              </w:rPr>
-              <w:t xml:space="preserve">on-demand</w:t>
-            </w:r>
-            <w:r>
-              <w:t xml:space="preserve"> </w:t>
-            </w:r>
-            <w:r>
-              <w:t xml:space="preserve">de funciones génicas.</w:t>
-            </w:r>
-          </w:p>
-        </w:tc>
-        <w:tc>
-          <w:tcPr/>
-          <w:p>
-            <w:pPr>
-              <w:pStyle w:val="Compact"/>
-              <w:jc w:val="center"/>
-            </w:pPr>
-            <w:r>
-              <w:t xml:space="preserve">(D) Arquitectura de Subgenomas:</w:t>
-            </w:r>
-            <w:r>
-              <w:t xml:space="preserve"> </w:t>
-            </w:r>
-            <w:r>
-              <w:t xml:space="preserve">Mapeo estructural focalizado de una línea comercial contra la referencia ancestral.</w:t>
-            </w:r>
-          </w:p>
-        </w:tc>
-      </w:tr>
-      <w:tr>
-        <w:tc>
-          <w:tcPr/>
-          <w:p>
-            <w:pPr>
-              <w:pStyle w:val="Compact"/>
-              <w:jc w:val="center"/>
-            </w:pPr>
-            <w:r>
-              <w:t xml:space="preserve">Heatmap Evolutivo</w:t>
-            </w:r>
-          </w:p>
-        </w:tc>
-        <w:tc>
-          <w:tcPr/>
-          <w:p>
-            <w:pPr>
-              <w:pStyle w:val="Compact"/>
-              <w:jc w:val="center"/>
-            </w:pPr>
-            <w:r>
-              <w:t xml:space="preserve">Correlación Evolutiva/Estructural</w:t>
-            </w:r>
-          </w:p>
-        </w:tc>
-      </w:tr>
-      <w:tr>
-        <w:tc>
-          <w:tcPr/>
-          <w:p>
-            <w:pPr>
-              <w:pStyle w:val="Compact"/>
-              <w:jc w:val="center"/>
-            </w:pPr>
-            <w:r>
-              <w:t xml:space="preserve">(E) Mapa de Calor Evolutivo (SNPs):</w:t>
-            </w:r>
-            <w:r>
-              <w:t xml:space="preserve"> </w:t>
-            </w:r>
-            <w:r>
-              <w:t xml:space="preserve">Transición de la vista física a funcional, coloreando los bloques por su diversidad poblacional.</w:t>
-            </w:r>
-          </w:p>
-        </w:tc>
-        <w:tc>
-          <w:tcPr/>
-          <w:p>
-            <w:pPr>
-              <w:pStyle w:val="Compact"/>
-              <w:jc w:val="center"/>
-            </w:pPr>
-            <w:r>
-              <w:t xml:space="preserve">(F) Hotspots Mutacionales:</w:t>
-            </w:r>
-            <w:r>
-              <w:t xml:space="preserve"> </w:t>
-            </w:r>
-            <w:r>
-              <w:t xml:space="preserve">Visualización térmica sobre la estructura, identificando zonas de alta presión selectiva (rojo) y alta conservación (verde/azul).</w:t>
-            </w:r>
-          </w:p>
-        </w:tc>
-      </w:tr>
-      <w:tr>
-        <w:tc>
-          <w:tcPr/>
-          <w:p>
-            <w:pPr>
-              <w:pStyle w:val="Compact"/>
-              <w:jc w:val="center"/>
-            </w:pPr>
-            <w:r>
-              <w:t xml:space="preserve">Topología Circos</w:t>
-            </w:r>
-          </w:p>
-        </w:tc>
-        <w:tc>
-          <w:tcPr/>
-          <w:p>
-            <w:pPr>
-              <w:pStyle w:val="Compact"/>
-              <w:jc w:val="center"/>
-            </w:pPr>
-            <w:r>
-              <w:t xml:space="preserve">Aislamiento Circos</w:t>
-            </w:r>
-          </w:p>
-        </w:tc>
-      </w:tr>
-      <w:tr>
-        <w:tc>
-          <w:tcPr/>
-          <w:p>
-            <w:pPr>
-              <w:pStyle w:val="Compact"/>
-              <w:jc w:val="center"/>
-            </w:pPr>
-            <w:r>
-              <w:t xml:space="preserve">(G) Topología Circular (Circos):</w:t>
-            </w:r>
-            <w:r>
-              <w:t xml:space="preserve"> </w:t>
-            </w:r>
-            <w:r>
-              <w:t xml:space="preserve">Alineamiento de un cromosoma comercial contra múltiples alelos homólogos, ideal para análisis poliploides.</w:t>
-            </w:r>
-          </w:p>
-        </w:tc>
-        <w:tc>
-          <w:tcPr/>
-          <w:p>
-            <w:pPr>
-              <w:pStyle w:val="Compact"/>
-              <w:jc w:val="center"/>
-            </w:pPr>
-            <w:r>
-              <w:t xml:space="preserve">(H) Aislamiento de Señales:</w:t>
-            </w:r>
-            <w:r>
-              <w:t xml:space="preserve"> </w:t>
-            </w:r>
-            <w:r>
-              <w:t xml:space="preserve">Interacción de foco (</w:t>
-            </w:r>
-            <w:r>
-              <w:rPr>
-                <w:i/>
-                <w:iCs/>
-              </w:rPr>
-              <w:t xml:space="preserve">hover</w:t>
-            </w:r>
-            <w:r>
-              <w:t xml:space="preserve">) para iluminar relaciones ortólogas específicas en redes densas.</w:t>
-            </w:r>
-          </w:p>
-        </w:tc>
-      </w:tr>
-    </w:tbl>
-    <w:p>
-      <w:pPr>
-        <w:pStyle w:val="BlockText"/>
-      </w:pPr>
-      <w:r>
-        <w:t xml:space="preserve">[!NOTE]</w:t>
-      </w:r>
-      <w:r>
-        <w:t xml:space="preserve"> </w:t>
-      </w:r>
-      <w:r>
-        <w:rPr>
-          <w:b/>
-          <w:bCs/>
-        </w:rPr>
-        <w:t xml:space="preserve">Exploración Genómica en Vivo:</w:t>
-      </w:r>
-      <w:r>
-        <w:t xml:space="preserve"> </w:t>
-      </w:r>
-      <w:r>
-        <w:t xml:space="preserve">La Figura 6 presenta capturas estáticas de la suite analítica</w:t>
-      </w:r>
-      <w:r>
-        <w:t xml:space="preserve"> </w:t>
-      </w:r>
-      <w:r>
-        <w:rPr>
-          <w:rStyle w:val="VerbatimChar"/>
-        </w:rPr>
-        <w:t xml:space="preserve">comp-gen</w:t>
-      </w:r>
-      <w:r>
-        <w:t xml:space="preserve">. Puedes interactuar de forma inmersiva con el</w:t>
+    <w:p>
+      <w:pPr>
+        <w:pStyle w:val="BodyText"/>
+      </w:pPr>
+      <w:r>
+        <w:t xml:space="preserve"> </w:t>
+      </w:r>
+      <w:r>
+        <w:t xml:space="preserve"> </w:t>
+      </w:r>
+      <w:r>
+        <w:t xml:space="preserve"> </w:t>
+      </w:r>
+      <w:r>
+        <w:t xml:space="preserve">(A) Macro-Sintenia Pan-genómica:</w:t>
+      </w:r>
+      <w:r>
+        <w:t xml:space="preserve"> </w:t>
+      </w:r>
+      <w:r>
+        <w:t xml:space="preserve">Mapeo masivo de genomas completos (&gt;110k genes cruzados);</w:t>
+      </w:r>
+      <w:r>
+        <w:t xml:space="preserve"> </w:t>
+      </w:r>
+      <w:r>
+        <w:t xml:space="preserve">(B) Filtrado Estructural Dinámico:</w:t>
+      </w:r>
+      <w:r>
+        <w:t xml:space="preserve"> </w:t>
+      </w:r>
+      <w:r>
+        <w:t xml:space="preserve">Aislamiento de regiones sinténicas mediante selección de secuencias homólogas.</w:t>
+      </w:r>
+    </w:p>
+    <w:p>
+      <w:pPr>
+        <w:pStyle w:val="BodyText"/>
+      </w:pPr>
+      <w:r>
+        <w:t xml:space="preserve"> </w:t>
+      </w:r>
+      <w:r>
+        <w:t xml:space="preserve"> </w:t>
+      </w:r>
+      <w:r>
+        <w:t xml:space="preserve"> </w:t>
+      </w:r>
+      <w:r>
+        <w:t xml:space="preserve">(C) Depuración de Ruido e Interactividad:</w:t>
+      </w:r>
+      <w:r>
+        <w:t xml:space="preserve"> </w:t>
+      </w:r>
+      <w:r>
+        <w:t xml:space="preserve">Aplicación de umbrales altos de conservación y extracción</w:t>
       </w:r>
       <w:r>
         <w:t xml:space="preserve"> </w:t>
@@ -7529,6 +7695,146 @@
           <w:i/>
           <w:iCs/>
         </w:rPr>
+        <w:t xml:space="preserve">on-demand</w:t>
+      </w:r>
+      <w:r>
+        <w:t xml:space="preserve"> </w:t>
+      </w:r>
+      <w:r>
+        <w:t xml:space="preserve">de funciones génicas;</w:t>
+      </w:r>
+      <w:r>
+        <w:t xml:space="preserve"> </w:t>
+      </w:r>
+      <w:r>
+        <w:t xml:space="preserve">(D) Arquitectura de Subgenomas:</w:t>
+      </w:r>
+      <w:r>
+        <w:t xml:space="preserve"> </w:t>
+      </w:r>
+      <w:r>
+        <w:t xml:space="preserve">Mapeo estructural focalizado de una línea comercial contra la referencia ancestral.</w:t>
+      </w:r>
+    </w:p>
+    <w:p>
+      <w:pPr>
+        <w:pStyle w:val="BodyText"/>
+      </w:pPr>
+      <w:r>
+        <w:t xml:space="preserve"> </w:t>
+      </w:r>
+      <w:r>
+        <w:t xml:space="preserve"> </w:t>
+      </w:r>
+      <w:r>
+        <w:t xml:space="preserve"> </w:t>
+      </w:r>
+      <w:r>
+        <w:t xml:space="preserve">(E) Mapa de Calor Evolutivo (SNPs):</w:t>
+      </w:r>
+      <w:r>
+        <w:t xml:space="preserve"> </w:t>
+      </w:r>
+      <w:r>
+        <w:t xml:space="preserve">Transición de la vista física a funcional, coloreando los bloques por su diversidad poblacional;</w:t>
+      </w:r>
+      <w:r>
+        <w:t xml:space="preserve"> </w:t>
+      </w:r>
+      <w:r>
+        <w:t xml:space="preserve">(F) Hotspots Mutacionales:</w:t>
+      </w:r>
+      <w:r>
+        <w:t xml:space="preserve"> </w:t>
+      </w:r>
+      <w:r>
+        <w:t xml:space="preserve">Visualización térmica sobre la estructura, identificando zonas de alta presión selectiva (rojo) y alta conservación (verde/azul).</w:t>
+      </w:r>
+    </w:p>
+    <w:p>
+      <w:pPr>
+        <w:pStyle w:val="BodyText"/>
+      </w:pPr>
+      <w:r>
+        <w:t xml:space="preserve"> </w:t>
+      </w:r>
+      <w:r>
+        <w:t xml:space="preserve"> </w:t>
+      </w:r>
+      <w:r>
+        <w:t xml:space="preserve"> </w:t>
+      </w:r>
+      <w:r>
+        <w:t xml:space="preserve">(G) Topología Circular (Circos):</w:t>
+      </w:r>
+      <w:r>
+        <w:t xml:space="preserve"> </w:t>
+      </w:r>
+      <w:r>
+        <w:t xml:space="preserve">Alineamiento de un cromosoma comercial contra múltiples alelos homólogos, ideal para análisis poliploides;</w:t>
+      </w:r>
+      <w:r>
+        <w:t xml:space="preserve"> </w:t>
+      </w:r>
+      <w:r>
+        <w:t xml:space="preserve">(H) Aislamiento de Señales:</w:t>
+      </w:r>
+      <w:r>
+        <w:t xml:space="preserve"> </w:t>
+      </w:r>
+      <w:r>
+        <w:t xml:space="preserve">Interacción de foco (</w:t>
+      </w:r>
+      <w:r>
+        <w:t xml:space="preserve">hover</w:t>
+      </w:r>
+      <w:r>
+        <w:t xml:space="preserve">) para iluminar relaciones ortólogas específicas en redes densas.</w:t>
+      </w:r>
+    </w:p>
+    <w:p>
+      <w:pPr>
+        <w:pStyle w:val="BlockText"/>
+      </w:pPr>
+      <w:r>
+        <w:t xml:space="preserve">[!NOTE]</w:t>
+      </w:r>
+      <w:r>
+        <w:t xml:space="preserve"> </w:t>
+      </w:r>
+      <w:r>
+        <w:rPr>
+          <w:b/>
+          <w:bCs/>
+        </w:rPr>
+        <w:t xml:space="preserve">Exploración Genómica en Vivo:</w:t>
+      </w:r>
+      <w:r>
+        <w:t xml:space="preserve"> </w:t>
+      </w:r>
+      <w:r>
+        <w:t xml:space="preserve">La Figura 6 presenta capturas estáticas de la suite analítica</w:t>
+      </w:r>
+      <w:r>
+        <w:t xml:space="preserve"> </w:t>
+      </w:r>
+      <w:r>
+        <w:rPr>
+          <w:rStyle w:val="VerbatimChar"/>
+        </w:rPr>
+        <w:t xml:space="preserve">comp-gen</w:t>
+      </w:r>
+      <w:r>
+        <w:t xml:space="preserve">. Puedes interactuar de forma inmersiva con el</w:t>
+      </w:r>
+      <w:r>
+        <w:t xml:space="preserve"> </w:t>
+      </w:r>
+      <w:r>
+        <w:rPr>
+          <w:i/>
+          <w:iCs/>
+        </w:rPr>
         <w:t xml:space="preserve">Heatmap Evolutivo</w:t>
       </w:r>
       <w:r>
@@ -7537,7 +7843,7 @@
       <w:r>
         <w:t xml:space="preserve"> </w:t>
       </w:r>
-      <w:hyperlink r:id="rId28">
+      <w:hyperlink r:id="rId29">
         <w:r>
           <w:rPr>
             <w:rStyle w:val="Hyperlink"/>
@@ -7553,6 +7859,25 @@
         </w:pict>
       </w:r>
     </w:p>
+    <w:bookmarkEnd w:id="30"/>
+    <w:bookmarkEnd w:id="31"/>
+    <w:bookmarkStart w:id="32" w:name="disponibilidad-de-datos"/>
+    <w:p>
+      <w:pPr>
+        <w:pStyle w:val="Heading2"/>
+      </w:pPr>
+      <w:r>
+        <w:t xml:space="preserve">Disponibilidad de Datos</w:t>
+      </w:r>
+    </w:p>
+    <w:p>
+      <w:pPr>
+        <w:pStyle w:val="FirstParagraph"/>
+      </w:pPr>
+      <w:r>
+        <w:t xml:space="preserve">El código fuente, el archivo JAR precompilado y los conjuntos de datos de simulación están disponibles en: https://github.com/jhtrujillo/biocenicana (Licencia MIT). Los datos crudos de secuenciación serán depositados en el NCBI Sequence Read Archive (SRA) tras la aceptación del artículo [Acceso: pendiente]. El VCF filtrado y todos los archivos de salida de los análisis están disponibles por parte del autor para correspondencia bajo solicitud razonable.</w:t>
+      </w:r>
+    </w:p>
     <w:p>
       <w:r>
         <w:pict>
@@ -7560,15 +7885,14 @@
         </w:pict>
       </w:r>
     </w:p>
-    <w:bookmarkEnd w:id="29"/>
-    <w:bookmarkEnd w:id="30"/>
-    <w:bookmarkStart w:id="31" w:name="disponibilidad-de-datos"/>
+    <w:bookmarkEnd w:id="32"/>
+    <w:bookmarkStart w:id="33" w:name="contribuciones-de-los-autores"/>
     <w:p>
       <w:pPr>
         <w:pStyle w:val="Heading2"/>
       </w:pPr>
       <w:r>
-        <w:t xml:space="preserve">Disponibilidad de Datos</w:t>
+        <w:t xml:space="preserve">Contribuciones de los Autores</w:t>
       </w:r>
     </w:p>
     <w:p>
@@ -7576,7 +7900,7 @@
         <w:pStyle w:val="FirstParagraph"/>
       </w:pPr>
       <w:r>
-        <w:t xml:space="preserve">El código fuente, el archivo JAR precompilado y los conjuntos de datos de simulación están disponibles en: https://github.com/jhtrujillo/biocenicana (Licencia MIT). Los datos crudos de secuenciación serán depositados en el NCBI Sequence Read Archive (SRA) tras la aceptación del artículo [Acceso: pendiente]. El VCF filtrado y todos los archivos de salida de los análisis están disponibles por parte del autor para correspondencia bajo solicitud razonable.</w:t>
+        <w:t xml:space="preserve">J.H.T.M.: conceptualización, diseño e implementación del software, análisis formal, visualización, escritura (borrador original). [Co-autor]: [rol]. [Co-autor]: [rol]. Todos los autores revisaron y aprobaron el manuscrito final.</w:t>
       </w:r>
     </w:p>
     <w:p>
@@ -7586,14 +7910,14 @@
         </w:pict>
       </w:r>
     </w:p>
-    <w:bookmarkEnd w:id="31"/>
-    <w:bookmarkStart w:id="32" w:name="contribuciones-de-los-autores"/>
+    <w:bookmarkEnd w:id="33"/>
+    <w:bookmarkStart w:id="34" w:name="agradecimientos"/>
     <w:p>
       <w:pPr>
         <w:pStyle w:val="Heading2"/>
       </w:pPr>
       <w:r>
-        <w:t xml:space="preserve">Contribuciones de los Autores</w:t>
+        <w:t xml:space="preserve">Agradecimientos</w:t>
       </w:r>
     </w:p>
     <w:p>
@@ -7601,7 +7925,7 @@
         <w:pStyle w:val="FirstParagraph"/>
       </w:pPr>
       <w:r>
-        <w:t xml:space="preserve">J.H.T.M.: conceptualización, diseño e implementación del software, análisis formal, visualización, escritura (borrador original). [Co-autor]: [rol]. [Co-autor]: [rol]. Todos los autores revisaron y aprobaron el manuscrito final.</w:t>
+        <w:t xml:space="preserve">Los autores agradecen a los equipos de germoplasma y biología molecular de Cenicaña por proporcionar el material vegetal y los datos de genotipado. [Agencia financiadora y números de subvención.]</w:t>
       </w:r>
     </w:p>
     <w:p>
@@ -7611,14 +7935,14 @@
         </w:pict>
       </w:r>
     </w:p>
-    <w:bookmarkEnd w:id="32"/>
-    <w:bookmarkStart w:id="33" w:name="agradecimientos"/>
+    <w:bookmarkEnd w:id="34"/>
+    <w:bookmarkStart w:id="35" w:name="conflicto-de-intereses"/>
     <w:p>
       <w:pPr>
         <w:pStyle w:val="Heading2"/>
       </w:pPr>
       <w:r>
-        <w:t xml:space="preserve">Agradecimientos</w:t>
+        <w:t xml:space="preserve">Conflicto de Intereses</w:t>
       </w:r>
     </w:p>
     <w:p>
@@ -7626,7 +7950,7 @@
         <w:pStyle w:val="FirstParagraph"/>
       </w:pPr>
       <w:r>
-        <w:t xml:space="preserve">Los autores agradecen a los equipos de germoplasma y biología molecular de Cenicaña por proporcionar el material vegetal y los datos de genotipado. [Agencia financiadora y números de subvención.]</w:t>
+        <w:t xml:space="preserve">Los autores declaran no tener conflictos de intereses.</w:t>
       </w:r>
     </w:p>
     <w:p>
@@ -7636,14 +7960,14 @@
         </w:pict>
       </w:r>
     </w:p>
-    <w:bookmarkEnd w:id="33"/>
-    <w:bookmarkStart w:id="34" w:name="conflicto-de-intereses"/>
+    <w:bookmarkEnd w:id="35"/>
+    <w:bookmarkStart w:id="36" w:name="referencias"/>
     <w:p>
       <w:pPr>
         <w:pStyle w:val="Heading2"/>
       </w:pPr>
       <w:r>
-        <w:t xml:space="preserve">Conflicto de Intereses</w:t>
+        <w:t xml:space="preserve">Referencias</w:t>
       </w:r>
     </w:p>
     <w:p>
@@ -7651,7 +7975,506 @@
         <w:pStyle w:val="FirstParagraph"/>
       </w:pPr>
       <w:r>
-        <w:t xml:space="preserve">Los autores declaran no tener conflictos de intereses.</w:t>
+        <w:t xml:space="preserve">Bradbury, P.J., Zhang, Z., Kroon, D.E., Casstevens, T.M., Ramdoss, Y., &amp; Buckler, E.S. (2007). TASSEL: Software for association mapping of complex traits in diverse samples.</w:t>
+      </w:r>
+      <w:r>
+        <w:t xml:space="preserve"> </w:t>
+      </w:r>
+      <w:r>
+        <w:rPr>
+          <w:i/>
+          <w:iCs/>
+        </w:rPr>
+        <w:t xml:space="preserve">Bioinformatics</w:t>
+      </w:r>
+      <w:r>
+        <w:t xml:space="preserve">, 23(19), 2633–2635. https://doi.org/10.1093/bioinformatics/btm308</w:t>
+      </w:r>
+    </w:p>
+    <w:p>
+      <w:pPr>
+        <w:pStyle w:val="BodyText"/>
+      </w:pPr>
+      <w:r>
+        <w:t xml:space="preserve">Clark, L.V., Lipka, A.E., &amp; Sacks, E.J. (2019). polyRAD: Genotype calling with uncertainty from sequencing data in polyploids and diploids.</w:t>
+      </w:r>
+      <w:r>
+        <w:t xml:space="preserve"> </w:t>
+      </w:r>
+      <w:r>
+        <w:rPr>
+          <w:i/>
+          <w:iCs/>
+        </w:rPr>
+        <w:t xml:space="preserve">G3: Genes, Genomes, Genetics</w:t>
+      </w:r>
+      <w:r>
+        <w:t xml:space="preserve">, 9(3), 663–673. https://doi.org/10.1534/g3.118.200913</w:t>
+      </w:r>
+    </w:p>
+    <w:p>
+      <w:pPr>
+        <w:pStyle w:val="BodyText"/>
+      </w:pPr>
+      <w:r>
+        <w:t xml:space="preserve">D’Hont, A., Grivet, L., Feldmann, P., Rao, S., Berding, N., &amp; Glaszmann, J.C. (1996). Characterisation of the double genome structure of modern sugarcane cultivars (</w:t>
+      </w:r>
+      <w:r>
+        <w:rPr>
+          <w:i/>
+          <w:iCs/>
+        </w:rPr>
+        <w:t xml:space="preserve">Saccharum</w:t>
+      </w:r>
+      <w:r>
+        <w:t xml:space="preserve"> </w:t>
+      </w:r>
+      <w:r>
+        <w:t xml:space="preserve">spp.) by molecular cytogenetics.</w:t>
+      </w:r>
+      <w:r>
+        <w:t xml:space="preserve"> </w:t>
+      </w:r>
+      <w:r>
+        <w:rPr>
+          <w:i/>
+          <w:iCs/>
+        </w:rPr>
+        <w:t xml:space="preserve">Molecular and General Genetics</w:t>
+      </w:r>
+      <w:r>
+        <w:t xml:space="preserve">, 250(4), 405–413. https://doi.org/10.1007/BF02174028</w:t>
+      </w:r>
+    </w:p>
+    <w:p>
+      <w:pPr>
+        <w:pStyle w:val="BodyText"/>
+      </w:pPr>
+      <w:r>
+        <w:t xml:space="preserve">Dempster, A.P., Laird, N.M., &amp; Rubin, D.B. (1977). Maximum likelihood from incomplete data via the EM algorithm.</w:t>
+      </w:r>
+      <w:r>
+        <w:t xml:space="preserve"> </w:t>
+      </w:r>
+      <w:r>
+        <w:rPr>
+          <w:i/>
+          <w:iCs/>
+        </w:rPr>
+        <w:t xml:space="preserve">Journal of the Royal Statistical Society: Series B</w:t>
+      </w:r>
+      <w:r>
+        <w:t xml:space="preserve">, 39(1), 1–22.</w:t>
+      </w:r>
+    </w:p>
+    <w:p>
+      <w:pPr>
+        <w:pStyle w:val="BodyText"/>
+      </w:pPr>
+      <w:r>
+        <w:t xml:space="preserve">Ester, M., Kriegel, H.P., Sander, J., &amp; Xu, X. (1996). A density-based algorithm for discovering clusters in large spatial databases with noise.</w:t>
+      </w:r>
+      <w:r>
+        <w:t xml:space="preserve"> </w:t>
+      </w:r>
+      <w:r>
+        <w:rPr>
+          <w:i/>
+          <w:iCs/>
+        </w:rPr>
+        <w:t xml:space="preserve">Proceedings of the 2nd International Conference on Knowledge Discovery and Data Mining (KDD)</w:t>
+      </w:r>
+      <w:r>
+        <w:t xml:space="preserve">, 226–231.</w:t>
+      </w:r>
+    </w:p>
+    <w:p>
+      <w:pPr>
+        <w:pStyle w:val="BodyText"/>
+      </w:pPr>
+      <w:r>
+        <w:t xml:space="preserve">FAO. (2022).</w:t>
+      </w:r>
+      <w:r>
+        <w:t xml:space="preserve"> </w:t>
+      </w:r>
+      <w:r>
+        <w:rPr>
+          <w:i/>
+          <w:iCs/>
+        </w:rPr>
+        <w:t xml:space="preserve">FAOSTAT: Crops and livestock products</w:t>
+      </w:r>
+      <w:r>
+        <w:t xml:space="preserve">. Food and Agriculture Organization of the United Nations. https://www.fao.org/faostat/</w:t>
+      </w:r>
+    </w:p>
+    <w:p>
+      <w:pPr>
+        <w:pStyle w:val="BodyText"/>
+      </w:pPr>
+      <w:r>
+        <w:t xml:space="preserve">Garcia, A.A.F., Mollinari, M., Marconi, T.G., Serang, O.R., Silva, R.R., Vieira, M.L.C., … Souza, A.P. (2013). SNP genotyping allows an in-depth characterisation of the genome of sugarcane and other complex autopolyploids.</w:t>
+      </w:r>
+      <w:r>
+        <w:t xml:space="preserve"> </w:t>
+      </w:r>
+      <w:r>
+        <w:rPr>
+          <w:i/>
+          <w:iCs/>
+        </w:rPr>
+        <w:t xml:space="preserve">Scientific Reports</w:t>
+      </w:r>
+      <w:r>
+        <w:t xml:space="preserve">, 3, 3399. https://doi.org/10.1038/srep03399</w:t>
+      </w:r>
+    </w:p>
+    <w:p>
+      <w:pPr>
+        <w:pStyle w:val="BodyText"/>
+      </w:pPr>
+      <w:r>
+        <w:t xml:space="preserve">Garrison, E., &amp; Marth, G. (2012). Haplotype-based variant detection from short-read sequencing.</w:t>
+      </w:r>
+      <w:r>
+        <w:t xml:space="preserve"> </w:t>
+      </w:r>
+      <w:r>
+        <w:rPr>
+          <w:i/>
+          <w:iCs/>
+        </w:rPr>
+        <w:t xml:space="preserve">arXiv preprint</w:t>
+      </w:r>
+      <w:r>
+        <w:t xml:space="preserve">, arXiv:1207.3907.</w:t>
+      </w:r>
+    </w:p>
+    <w:p>
+      <w:pPr>
+        <w:pStyle w:val="BodyText"/>
+      </w:pPr>
+      <w:r>
+        <w:t xml:space="preserve">Gerard, D., Ferrão, L.F.V., Garcia, A.A.F., &amp; Stephens, M. (2018). Genotyping polyploids from messy sequencing data.</w:t>
+      </w:r>
+      <w:r>
+        <w:t xml:space="preserve"> </w:t>
+      </w:r>
+      <w:r>
+        <w:rPr>
+          <w:i/>
+          <w:iCs/>
+        </w:rPr>
+        <w:t xml:space="preserve">Genetics</w:t>
+      </w:r>
+      <w:r>
+        <w:t xml:space="preserve">, 210(3), 789–807. https://doi.org/10.1534/genetics.118.301468</w:t>
+      </w:r>
+    </w:p>
+    <w:p>
+      <w:pPr>
+        <w:pStyle w:val="BodyText"/>
+      </w:pPr>
+      <w:r>
+        <w:t xml:space="preserve">Grivet, L., &amp; Arruda, P. (2001). Sugarcane genomics: depicting the complex genome of an important tropical crop.</w:t>
+      </w:r>
+      <w:r>
+        <w:t xml:space="preserve"> </w:t>
+      </w:r>
+      <w:r>
+        <w:rPr>
+          <w:i/>
+          <w:iCs/>
+        </w:rPr>
+        <w:t xml:space="preserve">Current Opinion in Plant Biology</w:t>
+      </w:r>
+      <w:r>
+        <w:t xml:space="preserve">, 5(2), 122–127. https://doi.org/10.1016/S1369-5266(02)00234-0</w:t>
+      </w:r>
+    </w:p>
+    <w:p>
+      <w:pPr>
+        <w:pStyle w:val="BodyText"/>
+      </w:pPr>
+      <w:r>
+        <w:t xml:space="preserve">Hill, W.G., &amp; Robertson, A. (1968). Linkage disequilibrium in finite populations.</w:t>
+      </w:r>
+      <w:r>
+        <w:t xml:space="preserve"> </w:t>
+      </w:r>
+      <w:r>
+        <w:rPr>
+          <w:i/>
+          <w:iCs/>
+        </w:rPr>
+        <w:t xml:space="preserve">Theoretical and Applied Genetics</w:t>
+      </w:r>
+      <w:r>
+        <w:t xml:space="preserve">, 38(6), 226–231. https://doi.org/10.1007/BF01245622</w:t>
+      </w:r>
+    </w:p>
+    <w:p>
+      <w:pPr>
+        <w:pStyle w:val="BodyText"/>
+      </w:pPr>
+      <w:r>
+        <w:t xml:space="preserve">Lyons, E., Pedersen, B., Kane, J., Alam, M., Ming, R., Tang, H., … Freeling, M. (2008). Finding and comparing syntenic regions among</w:t>
+      </w:r>
+      <w:r>
+        <w:t xml:space="preserve"> </w:t>
+      </w:r>
+      <w:r>
+        <w:rPr>
+          <w:i/>
+          <w:iCs/>
+        </w:rPr>
+        <w:t xml:space="preserve">Arabidopsis</w:t>
+      </w:r>
+      <w:r>
+        <w:t xml:space="preserve"> </w:t>
+      </w:r>
+      <w:r>
+        <w:t xml:space="preserve">and the outgroups papaya, poplar, and grape: CoGe with rosids.</w:t>
+      </w:r>
+      <w:r>
+        <w:t xml:space="preserve"> </w:t>
+      </w:r>
+      <w:r>
+        <w:rPr>
+          <w:i/>
+          <w:iCs/>
+        </w:rPr>
+        <w:t xml:space="preserve">Plant Physiology</w:t>
+      </w:r>
+      <w:r>
+        <w:t xml:space="preserve">, 148(4), 1772–1781. https://doi.org/10.1104/pp.108.124867</w:t>
+      </w:r>
+    </w:p>
+    <w:p>
+      <w:pPr>
+        <w:pStyle w:val="BodyText"/>
+      </w:pPr>
+      <w:r>
+        <w:t xml:space="preserve">MacQueen, J. (1967). Some methods for classification and analysis of multivariate observations.</w:t>
+      </w:r>
+      <w:r>
+        <w:t xml:space="preserve"> </w:t>
+      </w:r>
+      <w:r>
+        <w:rPr>
+          <w:i/>
+          <w:iCs/>
+        </w:rPr>
+        <w:t xml:space="preserve">Proceedings of the 5th Berkeley Symposium on Mathematical Statistics and Probability</w:t>
+      </w:r>
+      <w:r>
+        <w:t xml:space="preserve">, 1, 281–297.</w:t>
+      </w:r>
+    </w:p>
+    <w:p>
+      <w:pPr>
+        <w:pStyle w:val="BodyText"/>
+      </w:pPr>
+      <w:r>
+        <w:t xml:space="preserve">McKenna, A., Hanna, M., Banks, E., Sivachenko, A., Cibulskis, K., Kernytsky, A., … DePristo, M.A. (2010). The Genome Analysis Toolkit: A MapReduce framework for analyzing next-generation DNA sequencing data.</w:t>
+      </w:r>
+      <w:r>
+        <w:t xml:space="preserve"> </w:t>
+      </w:r>
+      <w:r>
+        <w:rPr>
+          <w:i/>
+          <w:iCs/>
+        </w:rPr>
+        <w:t xml:space="preserve">Genome Research</w:t>
+      </w:r>
+      <w:r>
+        <w:t xml:space="preserve">, 20(9), 1297–1303. https://doi.org/10.1101/gr.107524.110</w:t>
+      </w:r>
+    </w:p>
+    <w:p>
+      <w:pPr>
+        <w:pStyle w:val="BodyText"/>
+      </w:pPr>
+      <w:r>
+        <w:t xml:space="preserve">Nei, M., &amp; Gojobori, T. (1986). Simple methods for estimating the numbers of synonymous and nonsynonymous nucleotide substitutions.</w:t>
+      </w:r>
+      <w:r>
+        <w:t xml:space="preserve"> </w:t>
+      </w:r>
+      <w:r>
+        <w:rPr>
+          <w:i/>
+          <w:iCs/>
+        </w:rPr>
+        <w:t xml:space="preserve">Molecular Biology and Evolution</w:t>
+      </w:r>
+      <w:r>
+        <w:t xml:space="preserve">, 3(5), 418–426. https://doi.org/10.1093/oxfordjournals.molbev.a040410</w:t>
+      </w:r>
+    </w:p>
+    <w:p>
+      <w:pPr>
+        <w:pStyle w:val="BodyText"/>
+      </w:pPr>
+      <w:r>
+        <w:t xml:space="preserve">Pritchard, J.K., Stephens, M., &amp; Donnelly, P. (2000). Inference of population structure using multilocus genotype data.</w:t>
+      </w:r>
+      <w:r>
+        <w:t xml:space="preserve"> </w:t>
+      </w:r>
+      <w:r>
+        <w:rPr>
+          <w:i/>
+          <w:iCs/>
+        </w:rPr>
+        <w:t xml:space="preserve">Genetics</w:t>
+      </w:r>
+      <w:r>
+        <w:t xml:space="preserve">, 155(2), 945–959.</w:t>
+      </w:r>
+    </w:p>
+    <w:p>
+      <w:pPr>
+        <w:pStyle w:val="BodyText"/>
+      </w:pPr>
+      <w:r>
+        <w:t xml:space="preserve">Purcell, S., Neale, B., Todd-Brown, K., Thomas, L., Ferreira, M.A.R., Bender, D., … Sham, P.C. (2007). PLINK: A tool set for whole-genome association and population-based linkage analyses.</w:t>
+      </w:r>
+      <w:r>
+        <w:t xml:space="preserve"> </w:t>
+      </w:r>
+      <w:r>
+        <w:rPr>
+          <w:i/>
+          <w:iCs/>
+        </w:rPr>
+        <w:t xml:space="preserve">American Journal of Human Genetics</w:t>
+      </w:r>
+      <w:r>
+        <w:t xml:space="preserve">, 81(3), 559–575. https://doi.org/10.1086/519795</w:t>
+      </w:r>
+    </w:p>
+    <w:p>
+      <w:pPr>
+        <w:pStyle w:val="BodyText"/>
+      </w:pPr>
+      <w:r>
+        <w:t xml:space="preserve">Rosyara, U.R., De Jong, W.S., Douches, D.S., &amp; Endelman, J.B. (2016). Software for genome-wide association studies in autopolyploids and its application to potato.</w:t>
+      </w:r>
+      <w:r>
+        <w:t xml:space="preserve"> </w:t>
+      </w:r>
+      <w:r>
+        <w:rPr>
+          <w:i/>
+          <w:iCs/>
+        </w:rPr>
+        <w:t xml:space="preserve">The Plant Genome</w:t>
+      </w:r>
+      <w:r>
+        <w:t xml:space="preserve">, 9(2), 1–10. https://doi.org/10.3835/plantgenome2015.08.0073</w:t>
+      </w:r>
+    </w:p>
+    <w:p>
+      <w:pPr>
+        <w:pStyle w:val="BodyText"/>
+      </w:pPr>
+      <w:r>
+        <w:t xml:space="preserve">Saitou, N., &amp; Nei, M. (1987). The neighbor-joining method: A new method for reconstructing phylogenetic trees.</w:t>
+      </w:r>
+      <w:r>
+        <w:t xml:space="preserve"> </w:t>
+      </w:r>
+      <w:r>
+        <w:rPr>
+          <w:i/>
+          <w:iCs/>
+        </w:rPr>
+        <w:t xml:space="preserve">Molecular Biology and Evolution</w:t>
+      </w:r>
+      <w:r>
+        <w:t xml:space="preserve">, 4(4), 406–425. https://doi.org/10.1093/oxfordjournals.molbev.a040454</w:t>
+      </w:r>
+    </w:p>
+    <w:p>
+      <w:pPr>
+        <w:pStyle w:val="BodyText"/>
+      </w:pPr>
+      <w:r>
+        <w:t xml:space="preserve">VanRaden, P.M. (2008). Efficient methods to compute genomic predictions.</w:t>
+      </w:r>
+      <w:r>
+        <w:t xml:space="preserve"> </w:t>
+      </w:r>
+      <w:r>
+        <w:rPr>
+          <w:i/>
+          <w:iCs/>
+        </w:rPr>
+        <w:t xml:space="preserve">Journal of Dairy Science</w:t>
+      </w:r>
+      <w:r>
+        <w:t xml:space="preserve">, 91(11), 4414–4423. https://doi.org/10.3168/jds.2007-0980</w:t>
+      </w:r>
+    </w:p>
+    <w:p>
+      <w:pPr>
+        <w:pStyle w:val="BodyText"/>
+      </w:pPr>
+      <w:r>
+        <w:t xml:space="preserve">Wang, Y., Tang, H., DeBarry, J.D., Tan, X., Li, J., Wang, X., … Paterson, A.H. (2012). MCScanX: A toolkit for detection and evolutionary analysis of gene synteny and collinearity.</w:t>
+      </w:r>
+      <w:r>
+        <w:t xml:space="preserve"> </w:t>
+      </w:r>
+      <w:r>
+        <w:rPr>
+          <w:i/>
+          <w:iCs/>
+        </w:rPr>
+        <w:t xml:space="preserve">Nucleic Acids Research</w:t>
+      </w:r>
+      <w:r>
+        <w:t xml:space="preserve">, 40(7), e49. https://doi.org/10.1093/nar/gkr1293</w:t>
+      </w:r>
+    </w:p>
+    <w:p>
+      <w:pPr>
+        <w:pStyle w:val="BodyText"/>
+      </w:pPr>
+      <w:r>
+        <w:t xml:space="preserve">Zhang, J., Zhang, X., Tang, H., Zhang, Q., Hua, X., Ma, X., … Ming, R. (2018). Allele-defined genome of the autopolyploid sugarcane</w:t>
+      </w:r>
+      <w:r>
+        <w:t xml:space="preserve"> </w:t>
+      </w:r>
+      <w:r>
+        <w:rPr>
+          <w:i/>
+          <w:iCs/>
+        </w:rPr>
+        <w:t xml:space="preserve">Saccharum spontaneum</w:t>
+      </w:r>
+      <w:r>
+        <w:t xml:space="preserve"> </w:t>
+      </w:r>
+      <w:r>
+        <w:t xml:space="preserve">L.</w:t>
+      </w:r>
+      <w:r>
+        <w:t xml:space="preserve"> </w:t>
+      </w:r>
+      <w:r>
+        <w:rPr>
+          <w:i/>
+          <w:iCs/>
+        </w:rPr>
+        <w:t xml:space="preserve">Nature Genetics</w:t>
+      </w:r>
+      <w:r>
+        <w:t xml:space="preserve">, 50(11), 1565–1573. https://doi.org/10.1038/s41588-018-0237-2</w:t>
       </w:r>
     </w:p>
     <w:p>
@@ -7661,544 +8484,20 @@
         </w:pict>
       </w:r>
     </w:p>
-    <w:bookmarkEnd w:id="34"/>
-    <w:bookmarkStart w:id="35" w:name="referencias"/>
-    <w:p>
-      <w:pPr>
-        <w:pStyle w:val="Heading2"/>
-      </w:pPr>
-      <w:r>
-        <w:t xml:space="preserve">Referencias</w:t>
-      </w:r>
-    </w:p>
     <w:p>
       <w:pPr>
         <w:pStyle w:val="FirstParagraph"/>
       </w:pPr>
-      <w:r>
-        <w:t xml:space="preserve">Bradbury, P.J., Zhang, Z., Kroon, D.E., Casstevens, T.M., Ramdoss, Y., &amp; Buckler, E.S. (2007). TASSEL: Software for association mapping of complex traits in diverse samples.</w:t>
-      </w:r>
-      <w:r>
-        <w:t xml:space="preserve"> </w:t>
-      </w:r>
       <w:r>
         <w:rPr>
           <w:i/>
           <w:iCs/>
         </w:rPr>
-        <w:t xml:space="preserve">Bioinformatics</w:t>
-      </w:r>
-      <w:r>
-        <w:t xml:space="preserve">, 23(19), 2633–2635. https://doi.org/10.1093/bioinformatics/btm308</w:t>
-      </w:r>
-    </w:p>
-    <w:p>
-      <w:pPr>
-        <w:pStyle w:val="BodyText"/>
-      </w:pPr>
-      <w:r>
-        <w:t xml:space="preserve">Clark, L.V., Lipka, A.E., &amp; Sacks, E.J. (2019). polyRAD: Genotype calling with uncertainty from sequencing data in polyploids and diploids.</w:t>
-      </w:r>
-      <w:r>
-        <w:t xml:space="preserve"> </w:t>
-      </w:r>
-      <w:r>
-        <w:rPr>
-          <w:i/>
-          <w:iCs/>
-        </w:rPr>
-        <w:t xml:space="preserve">G3: Genes, Genomes, Genetics</w:t>
-      </w:r>
-      <w:r>
-        <w:t xml:space="preserve">, 9(3), 663–673. https://doi.org/10.1534/g3.118.200913</w:t>
-      </w:r>
-    </w:p>
-    <w:p>
-      <w:pPr>
-        <w:pStyle w:val="BodyText"/>
-      </w:pPr>
-      <w:r>
-        <w:t xml:space="preserve">D’Hont, A., Grivet, L., Feldmann, P., Rao, S., Berding, N., &amp; Glaszmann, J.C. (1996). Characterisation of the double genome structure of modern sugarcane cultivars (</w:t>
-      </w:r>
-      <w:r>
-        <w:rPr>
-          <w:i/>
-          <w:iCs/>
-        </w:rPr>
-        <w:t xml:space="preserve">Saccharum</w:t>
-      </w:r>
-      <w:r>
-        <w:t xml:space="preserve"> </w:t>
-      </w:r>
-      <w:r>
-        <w:t xml:space="preserve">spp.) by molecular cytogenetics.</w:t>
-      </w:r>
-      <w:r>
-        <w:t xml:space="preserve"> </w:t>
-      </w:r>
-      <w:r>
-        <w:rPr>
-          <w:i/>
-          <w:iCs/>
-        </w:rPr>
-        <w:t xml:space="preserve">Molecular and General Genetics</w:t>
-      </w:r>
-      <w:r>
-        <w:t xml:space="preserve">, 250(4), 405–413. https://doi.org/10.1007/BF02174028</w:t>
-      </w:r>
-    </w:p>
-    <w:p>
-      <w:pPr>
-        <w:pStyle w:val="BodyText"/>
-      </w:pPr>
-      <w:r>
-        <w:t xml:space="preserve">Dempster, A.P., Laird, N.M., &amp; Rubin, D.B. (1977). Maximum likelihood from incomplete data via the EM algorithm.</w:t>
-      </w:r>
-      <w:r>
-        <w:t xml:space="preserve"> </w:t>
-      </w:r>
-      <w:r>
-        <w:rPr>
-          <w:i/>
-          <w:iCs/>
-        </w:rPr>
-        <w:t xml:space="preserve">Journal of the Royal Statistical Society: Series B</w:t>
-      </w:r>
-      <w:r>
-        <w:t xml:space="preserve">, 39(1), 1–22.</w:t>
-      </w:r>
-    </w:p>
-    <w:p>
-      <w:pPr>
-        <w:pStyle w:val="BodyText"/>
-      </w:pPr>
-      <w:r>
-        <w:t xml:space="preserve">Ester, M., Kriegel, H.P., Sander, J., &amp; Xu, X. (1996). A density-based algorithm for discovering clusters in large spatial databases with noise.</w:t>
-      </w:r>
-      <w:r>
-        <w:t xml:space="preserve"> </w:t>
-      </w:r>
-      <w:r>
-        <w:rPr>
-          <w:i/>
-          <w:iCs/>
-        </w:rPr>
-        <w:t xml:space="preserve">Proceedings of the 2nd International Conference on Knowledge Discovery and Data Mining (KDD)</w:t>
-      </w:r>
-      <w:r>
-        <w:t xml:space="preserve">, 226–231.</w:t>
-      </w:r>
-    </w:p>
-    <w:p>
-      <w:pPr>
-        <w:pStyle w:val="BodyText"/>
-      </w:pPr>
-      <w:r>
-        <w:t xml:space="preserve">FAO. (2022).</w:t>
-      </w:r>
-      <w:r>
-        <w:t xml:space="preserve"> </w:t>
-      </w:r>
-      <w:r>
-        <w:rPr>
-          <w:i/>
-          <w:iCs/>
-        </w:rPr>
-        <w:t xml:space="preserve">FAOSTAT: Crops and livestock products</w:t>
-      </w:r>
-      <w:r>
-        <w:t xml:space="preserve">. Food and Agriculture Organization of the United Nations. https://www.fao.org/faostat/</w:t>
-      </w:r>
-    </w:p>
-    <w:p>
-      <w:pPr>
-        <w:pStyle w:val="BodyText"/>
-      </w:pPr>
-      <w:r>
-        <w:t xml:space="preserve">Garcia, A.A.F., Mollinari, M., Marconi, T.G., Serang, O.R., Silva, R.R., Vieira, M.L.C., … Souza, A.P. (2013). SNP genotyping allows an in-depth characterisation of the genome of sugarcane and other complex autopolyploids.</w:t>
-      </w:r>
-      <w:r>
-        <w:t xml:space="preserve"> </w:t>
-      </w:r>
-      <w:r>
-        <w:rPr>
-          <w:i/>
-          <w:iCs/>
-        </w:rPr>
-        <w:t xml:space="preserve">Scientific Reports</w:t>
-      </w:r>
-      <w:r>
-        <w:t xml:space="preserve">, 3, 3399. https://doi.org/10.1038/srep03399</w:t>
-      </w:r>
-    </w:p>
-    <w:p>
-      <w:pPr>
-        <w:pStyle w:val="BodyText"/>
-      </w:pPr>
-      <w:r>
-        <w:t xml:space="preserve">Garrison, E., &amp; Marth, G. (2012). Haplotype-based variant detection from short-read sequencing.</w:t>
-      </w:r>
-      <w:r>
-        <w:t xml:space="preserve"> </w:t>
-      </w:r>
-      <w:r>
-        <w:rPr>
-          <w:i/>
-          <w:iCs/>
-        </w:rPr>
-        <w:t xml:space="preserve">arXiv preprint</w:t>
-      </w:r>
-      <w:r>
-        <w:t xml:space="preserve">, arXiv:1207.3907.</w:t>
-      </w:r>
-    </w:p>
-    <w:p>
-      <w:pPr>
-        <w:pStyle w:val="BodyText"/>
-      </w:pPr>
-      <w:r>
-        <w:t xml:space="preserve">Gerard, D., Ferrão, L.F.V., Garcia, A.A.F., &amp; Stephens, M. (2018). Genotyping polyploids from messy sequencing data.</w:t>
-      </w:r>
-      <w:r>
-        <w:t xml:space="preserve"> </w:t>
-      </w:r>
-      <w:r>
-        <w:rPr>
-          <w:i/>
-          <w:iCs/>
-        </w:rPr>
-        <w:t xml:space="preserve">Genetics</w:t>
-      </w:r>
-      <w:r>
-        <w:t xml:space="preserve">, 210(3), 789–807. https://doi.org/10.1534/genetics.118.301468</w:t>
-      </w:r>
-    </w:p>
-    <w:p>
-      <w:pPr>
-        <w:pStyle w:val="BodyText"/>
-      </w:pPr>
-      <w:r>
-        <w:t xml:space="preserve">Grivet, L., &amp; Arruda, P. (2001). Sugarcane genomics: depicting the complex genome of an important tropical crop.</w:t>
-      </w:r>
-      <w:r>
-        <w:t xml:space="preserve"> </w:t>
-      </w:r>
-      <w:r>
-        <w:rPr>
-          <w:i/>
-          <w:iCs/>
-        </w:rPr>
-        <w:t xml:space="preserve">Current Opinion in Plant Biology</w:t>
-      </w:r>
-      <w:r>
-        <w:t xml:space="preserve">, 5(2), 122–127. https://doi.org/10.1016/S1369-5266(02)00234-0</w:t>
-      </w:r>
-    </w:p>
-    <w:p>
-      <w:pPr>
-        <w:pStyle w:val="BodyText"/>
-      </w:pPr>
-      <w:r>
-        <w:t xml:space="preserve">Hill, W.G., &amp; Robertson, A. (1968). Linkage disequilibrium in finite populations.</w:t>
-      </w:r>
-      <w:r>
-        <w:t xml:space="preserve"> </w:t>
-      </w:r>
-      <w:r>
-        <w:rPr>
-          <w:i/>
-          <w:iCs/>
-        </w:rPr>
-        <w:t xml:space="preserve">Theoretical and Applied Genetics</w:t>
-      </w:r>
-      <w:r>
-        <w:t xml:space="preserve">, 38(6), 226–231. https://doi.org/10.1007/BF01245622</w:t>
-      </w:r>
-    </w:p>
-    <w:p>
-      <w:pPr>
-        <w:pStyle w:val="BodyText"/>
-      </w:pPr>
-      <w:r>
-        <w:t xml:space="preserve">Lyons, E., Pedersen, B., Kane, J., Alam, M., Ming, R., Tang, H., … Freeling, M. (2008). Finding and comparing syntenic regions among</w:t>
-      </w:r>
-      <w:r>
-        <w:t xml:space="preserve"> </w:t>
-      </w:r>
-      <w:r>
-        <w:rPr>
-          <w:i/>
-          <w:iCs/>
-        </w:rPr>
-        <w:t xml:space="preserve">Arabidopsis</w:t>
-      </w:r>
-      <w:r>
-        <w:t xml:space="preserve"> </w:t>
-      </w:r>
-      <w:r>
-        <w:t xml:space="preserve">and the outgroups papaya, poplar, and grape: CoGe with rosids.</w:t>
-      </w:r>
-      <w:r>
-        <w:t xml:space="preserve"> </w:t>
-      </w:r>
-      <w:r>
-        <w:rPr>
-          <w:i/>
-          <w:iCs/>
-        </w:rPr>
-        <w:t xml:space="preserve">Plant Physiology</w:t>
-      </w:r>
-      <w:r>
-        <w:t xml:space="preserve">, 148(4), 1772–1781. https://doi.org/10.1104/pp.108.124867</w:t>
-      </w:r>
-    </w:p>
-    <w:p>
-      <w:pPr>
-        <w:pStyle w:val="BodyText"/>
-      </w:pPr>
-      <w:r>
-        <w:t xml:space="preserve">MacQueen, J. (1967). Some methods for classification and analysis of multivariate observations.</w:t>
-      </w:r>
-      <w:r>
-        <w:t xml:space="preserve"> </w:t>
-      </w:r>
-      <w:r>
-        <w:rPr>
-          <w:i/>
-          <w:iCs/>
-        </w:rPr>
-        <w:t xml:space="preserve">Proceedings of the 5th Berkeley Symposium on Mathematical Statistics and Probability</w:t>
-      </w:r>
-      <w:r>
-        <w:t xml:space="preserve">, 1, 281–297.</w:t>
-      </w:r>
-    </w:p>
-    <w:p>
-      <w:pPr>
-        <w:pStyle w:val="BodyText"/>
-      </w:pPr>
-      <w:r>
-        <w:t xml:space="preserve">McKenna, A., Hanna, M., Banks, E., Sivachenko, A., Cibulskis, K., Kernytsky, A., … DePristo, M.A. (2010). The Genome Analysis Toolkit: A MapReduce framework for analyzing next-generation DNA sequencing data.</w:t>
-      </w:r>
-      <w:r>
-        <w:t xml:space="preserve"> </w:t>
-      </w:r>
-      <w:r>
-        <w:rPr>
-          <w:i/>
-          <w:iCs/>
-        </w:rPr>
-        <w:t xml:space="preserve">Genome Research</w:t>
-      </w:r>
-      <w:r>
-        <w:t xml:space="preserve">, 20(9), 1297–1303. https://doi.org/10.1101/gr.107524.110</w:t>
-      </w:r>
-    </w:p>
-    <w:p>
-      <w:pPr>
-        <w:pStyle w:val="BodyText"/>
-      </w:pPr>
-      <w:r>
-        <w:t xml:space="preserve">Nei, M., &amp; Gojobori, T. (1986). Simple methods for estimating the numbers of synonymous and nonsynonymous nucleotide substitutions.</w:t>
-      </w:r>
-      <w:r>
-        <w:t xml:space="preserve"> </w:t>
-      </w:r>
-      <w:r>
-        <w:rPr>
-          <w:i/>
-          <w:iCs/>
-        </w:rPr>
-        <w:t xml:space="preserve">Molecular Biology and Evolution</w:t>
-      </w:r>
-      <w:r>
-        <w:t xml:space="preserve">, 3(5), 418–426. https://doi.org/10.1093/oxfordjournals.molbev.a040410</w:t>
-      </w:r>
-    </w:p>
-    <w:p>
-      <w:pPr>
-        <w:pStyle w:val="BodyText"/>
-      </w:pPr>
-      <w:r>
-        <w:t xml:space="preserve">Pritchard, J.K., Stephens, M., &amp; Donnelly, P. (2000). Inference of population structure using multilocus genotype data.</w:t>
-      </w:r>
-      <w:r>
-        <w:t xml:space="preserve"> </w:t>
-      </w:r>
-      <w:r>
-        <w:rPr>
-          <w:i/>
-          <w:iCs/>
-        </w:rPr>
-        <w:t xml:space="preserve">Genetics</w:t>
-      </w:r>
-      <w:r>
-        <w:t xml:space="preserve">, 155(2), 945–959.</w:t>
-      </w:r>
-    </w:p>
-    <w:p>
-      <w:pPr>
-        <w:pStyle w:val="BodyText"/>
-      </w:pPr>
-      <w:r>
-        <w:t xml:space="preserve">Purcell, S., Neale, B., Todd-Brown, K., Thomas, L., Ferreira, M.A.R., Bender, D., … Sham, P.C. (2007). PLINK: A tool set for whole-genome association and population-based linkage analyses.</w:t>
-      </w:r>
-      <w:r>
-        <w:t xml:space="preserve"> </w:t>
-      </w:r>
-      <w:r>
-        <w:rPr>
-          <w:i/>
-          <w:iCs/>
-        </w:rPr>
-        <w:t xml:space="preserve">American Journal of Human Genetics</w:t>
-      </w:r>
-      <w:r>
-        <w:t xml:space="preserve">, 81(3), 559–575. https://doi.org/10.1086/519795</w:t>
-      </w:r>
-    </w:p>
-    <w:p>
-      <w:pPr>
-        <w:pStyle w:val="BodyText"/>
-      </w:pPr>
-      <w:r>
-        <w:t xml:space="preserve">Rosyara, U.R., De Jong, W.S., Douches, D.S., &amp; Endelman, J.B. (2016). Software for genome-wide association studies in autopolyploids and its application to potato.</w:t>
-      </w:r>
-      <w:r>
-        <w:t xml:space="preserve"> </w:t>
-      </w:r>
-      <w:r>
-        <w:rPr>
-          <w:i/>
-          <w:iCs/>
-        </w:rPr>
-        <w:t xml:space="preserve">The Plant Genome</w:t>
-      </w:r>
-      <w:r>
-        <w:t xml:space="preserve">, 9(2), 1–10. https://doi.org/10.3835/plantgenome2015.08.0073</w:t>
-      </w:r>
-    </w:p>
-    <w:p>
-      <w:pPr>
-        <w:pStyle w:val="BodyText"/>
-      </w:pPr>
-      <w:r>
-        <w:t xml:space="preserve">Saitou, N., &amp; Nei, M. (1987). The neighbor-joining method: A new method for reconstructing phylogenetic trees.</w:t>
-      </w:r>
-      <w:r>
-        <w:t xml:space="preserve"> </w:t>
-      </w:r>
-      <w:r>
-        <w:rPr>
-          <w:i/>
-          <w:iCs/>
-        </w:rPr>
-        <w:t xml:space="preserve">Molecular Biology and Evolution</w:t>
-      </w:r>
-      <w:r>
-        <w:t xml:space="preserve">, 4(4), 406–425. https://doi.org/10.1093/oxfordjournals.molbev.a040454</w:t>
-      </w:r>
-    </w:p>
-    <w:p>
-      <w:pPr>
-        <w:pStyle w:val="BodyText"/>
-      </w:pPr>
-      <w:r>
-        <w:t xml:space="preserve">VanRaden, P.M. (2008). Efficient methods to compute genomic predictions.</w:t>
-      </w:r>
-      <w:r>
-        <w:t xml:space="preserve"> </w:t>
-      </w:r>
-      <w:r>
-        <w:rPr>
-          <w:i/>
-          <w:iCs/>
-        </w:rPr>
-        <w:t xml:space="preserve">Journal of Dairy Science</w:t>
-      </w:r>
-      <w:r>
-        <w:t xml:space="preserve">, 91(11), 4414–4423. https://doi.org/10.3168/jds.2007-0980</w:t>
-      </w:r>
-    </w:p>
-    <w:p>
-      <w:pPr>
-        <w:pStyle w:val="BodyText"/>
-      </w:pPr>
-      <w:r>
-        <w:t xml:space="preserve">Wang, Y., Tang, H., DeBarry, J.D., Tan, X., Li, J., Wang, X., … Paterson, A.H. (2012). MCScanX: A toolkit for detection and evolutionary analysis of gene synteny and collinearity.</w:t>
-      </w:r>
-      <w:r>
-        <w:t xml:space="preserve"> </w:t>
-      </w:r>
-      <w:r>
-        <w:rPr>
-          <w:i/>
-          <w:iCs/>
-        </w:rPr>
-        <w:t xml:space="preserve">Nucleic Acids Research</w:t>
-      </w:r>
-      <w:r>
-        <w:t xml:space="preserve">, 40(7), e49. https://doi.org/10.1093/nar/gkr1293</w:t>
-      </w:r>
-    </w:p>
-    <w:p>
-      <w:pPr>
-        <w:pStyle w:val="BodyText"/>
-      </w:pPr>
-      <w:r>
-        <w:t xml:space="preserve">Zhang, J., Zhang, X., Tang, H., Zhang, Q., Hua, X., Ma, X., … Ming, R. (2018). Allele-defined genome of the autopolyploid sugarcane</w:t>
-      </w:r>
-      <w:r>
-        <w:t xml:space="preserve"> </w:t>
-      </w:r>
-      <w:r>
-        <w:rPr>
-          <w:i/>
-          <w:iCs/>
-        </w:rPr>
-        <w:t xml:space="preserve">Saccharum spontaneum</w:t>
-      </w:r>
-      <w:r>
-        <w:t xml:space="preserve"> </w:t>
-      </w:r>
-      <w:r>
-        <w:t xml:space="preserve">L.</w:t>
-      </w:r>
-      <w:r>
-        <w:t xml:space="preserve"> </w:t>
-      </w:r>
-      <w:r>
-        <w:rPr>
-          <w:i/>
-          <w:iCs/>
-        </w:rPr>
-        <w:t xml:space="preserve">Nature Genetics</w:t>
-      </w:r>
-      <w:r>
-        <w:t xml:space="preserve">, 50(11), 1565–1573. https://doi.org/10.1038/s41588-018-0237-2</w:t>
-      </w:r>
-    </w:p>
-    <w:p>
-      <w:r>
-        <w:pict>
-          <v:rect style="width:0;height:1.5pt" o:hralign="center" o:hrstd="t" o:hr="t"/>
-        </w:pict>
-      </w:r>
-    </w:p>
-    <w:p>
-      <w:pPr>
-        <w:pStyle w:val="FirstParagraph"/>
-      </w:pPr>
-      <w:r>
-        <w:rPr>
-          <w:i/>
-          <w:iCs/>
-        </w:rPr>
         <w:t xml:space="preserve">Manuscrito formateado siguiendo las directrices de la revista The Plant Genome (American Society of Agronomy).</w:t>
       </w:r>
     </w:p>
-    <w:bookmarkEnd w:id="35"/>
     <w:bookmarkEnd w:id="36"/>
+    <w:bookmarkEnd w:id="37"/>
     <w:sectPr>
       <w:footnotePr>
         <w:numRestart w:val="eachSect"/>
@@ -8571,10 +8870,10 @@
   <w:docDefaults>
     <w:rPrDefault>
       <w:rPr>
-        <w:rFonts w:asciiTheme="minorHAnsi" w:cstheme="minorBidi" w:eastAsiaTheme="minorEastAsia" w:hAnsiTheme="minorHAnsi"/>
+        <w:rFonts w:asciiTheme="minorHAnsi" w:cstheme="minorBidi" w:eastAsiaTheme="minorHAnsi" w:hAnsiTheme="minorHAnsi"/>
         <w:sz w:val="24"/>
         <w:szCs w:val="24"/>
-        <w:lang w:bidi="ar-SA" w:eastAsia="zh-CN" w:val="en-US"/>
+        <w:lang w:bidi="ar-SA" w:eastAsia="en-US" w:val="en-US"/>
       </w:rPr>
     </w:rPrDefault>
     <w:pPrDefault>
@@ -9115,6 +9414,13 @@
       </w:tblCellMar>
     </w:tblPr>
     <w:tblStylePr w:type="firstRow">
+      <w:tblPr>
+        <w:jc w:val="left"/>
+        <w:tblInd w:type="dxa" w:w="0"/>
+      </w:tblPr>
+      <w:trPr>
+        <w:jc w:val="left"/>
+      </w:trPr>
       <w:tcPr>
         <w:tcBorders>
           <w:bottom w:val="single"/>

</xml_diff>